<commit_message>
feat: update working paper
</commit_message>
<xml_diff>
--- a/docs/INFOSYS_720_Assignment_5.docx
+++ b/docs/INFOSYS_720_Assignment_5.docx
@@ -240,7 +240,7 @@
         <w:fldChar w:fldCharType="begin"/>
       </w:r>
       <w:r>
-        <w:instrText xml:space="preserve"> ADDIN ZOTERO_ITEM CSL_CITATION {"citationID":"a11adlkfuq4","properties":{"unsorted":false,"formattedCitation":"(2004)","plainCitation":"(2004)","noteIndex":0},"citationItems":[{"id":115,"uris":["http://zotero.org/users/local/W3Vhviin/items/YYMUHPMN"],"itemData":{"id":115,"type":"article-journal","container-title":"MIS Quarterly","DOI":"10.2307/25148625","ISSN":"ISSN 0276-7783/ISSN 2162-9730","issue":"1","page":"75–105","source":"COinS","title":"Design science in information systems research","volume":"28","author":[{"family":"Hevner","given":"Alan"},{"family":"March","given":"Salvatore"},{"family":"Park","given":"Jinsoo"},{"family":"Ram","given":"Sudha"}],"issued":{"date-parts":[["2004",3,1]]}},"suppress-author":true}],"schema":"https://github.com/citation-style-language/schema/raw/master/csl-citation.json"} </w:instrText>
+        <w:instrText xml:space="preserve"> ADDIN ZOTERO_ITEM CSL_CITATION {"citationID":"a11adlkfuq4","properties":{"unsorted":false,"formattedCitation":"(2004)","plainCitation":"(2004)","noteIndex":0},"citationItems":[{"id":115,"uris":["http://zotero.org/users/local/W3Vhviin/items/YYMUHPMN"],"itemData":{"id":115,"type":"article-journal","container-title":"MIS Quarterly","DOI":"10.2307/25148625","ISSN":"ISSN 0276-7783/ISSN 2162-9730","issue":"1","page":"75–105","source":"COinS","title":"Design science in information systems research","volume":"28","author":[{"family":"Hevner","given":"A. R."},{"family":"March","given":"S. T."},{"family":"Park","given":"Jinsoo"},{"family":"Ram","given":"Sudha"}],"issued":{"date-parts":[["2004",3,1]]}},"suppress-author":true}],"schema":"https://github.com/citation-style-language/schema/raw/master/csl-citation.json"} </w:instrText>
       </w:r>
       <w:r>
         <w:fldChar w:fldCharType="separate"/>
@@ -1151,11 +1151,30 @@
       <w:r>
         <w:t xml:space="preserve">The reported preferences do not establish whether beginners understand those terms. Teacher-guided multilingual interaction in </w:t>
       </w:r>
-      <w:hyperlink r:id="rId8">
-        <w:r>
-          <w:t>Kuzu (2026)</w:t>
-        </w:r>
-      </w:hyperlink>
+      <w:r>
+        <w:t>Kuzu</w:t>
+      </w:r>
+      <w:r>
+        <w:t xml:space="preserve"> </w:t>
+      </w:r>
+      <w:r>
+        <w:fldChar w:fldCharType="begin"/>
+      </w:r>
+      <w:r>
+        <w:instrText xml:space="preserve"> ADDIN ZOTERO_ITEM CSL_CITATION {"citationID":"a1r06ii3flu","properties":{"unsorted":false,"formattedCitation":"(2026)","plainCitation":"(2026)","noteIndex":0},"citationItems":[{"id":99,"uris":["http://zotero.org/users/local/W3Vhviin/items/5V7MSIL2"],"itemData":{"id":99,"type":"article-journal","abstract":"This study investigates how artificial intelligence (AI) can support multilingual learners’ translanguaging processes and the activation of multilingual resources in primary education. Drawing on the Design-Based Research project KiKo-Prim, the article analyses interaction sequences between multilingual learners, teachers, and ChatGPT. Combining Design-Based Research with interpretive interaction analysis, the study provides exploratory insights into student–teacher–AI interactional dynamics, focusing on how AI was embedded as an integral component of the instructional design, how it scaffolded multilingual explanation practices, and how it mediated mathematical problem-solving and digital media production activities. The dataset comprises 462 conversational turns and 339 min of small-group video recordings from n = 13 learners in Grades 3–4. The findings suggest that ChatGPT can function as a 'multilingual buddy', supporting vocabulary retrieval, the refinement of explanations, and the production of multilingual learning artefacts, even in groups without shared multilingual repertoires. Productive AI use, however, depended on guided prompt-engineering practices, teacher facilitation, and the purposeful integration of AI into subject-specific learning environments. Based on these results, the article proposes initial design principles and pedagogical conditions for AI-supported translanguaging, with implications for inclusive, linguistically responsive teaching in digitally mediated primary classrooms.","container-title":"Technology, Knowledge and Learning","DOI":"10.1007/s10758-026-09974-7","ISSN":"2211-1662, 2211-1670","journalAbbreviation":"Tech Know Learn","language":"en","note":"status: Advance online publication","source":"DOI.org (Crossref)","title":"AI-supported translanguaging processes in primary school: Empirical insights into ChatGPT’s role in multilingual interactions","title-short":"AI-Supported Translanguaging Processes in Primary School","URL":"https://link.springer.com/10.1007/s10758-026-09974-7","author":[{"family":"Kuzu","given":"Taha Ertuğrul"}],"accessed":{"date-parts":[["2026",8,7]]},"issued":{"date-parts":[["2026",5,16]]}},"suppress-author":true}],"schema":"https://github.com/citation-style-language/schema/raw/master/csl-citation.json"} </w:instrText>
+      </w:r>
+      <w:r>
+        <w:fldChar w:fldCharType="separate"/>
+      </w:r>
+      <w:r>
+        <w:rPr>
+          <w:lang w:eastAsia="en-US"/>
+        </w:rPr>
+        <w:t>(2026)</w:t>
+      </w:r>
+      <w:r>
+        <w:fldChar w:fldCharType="end"/>
+      </w:r>
       <w:r>
         <w:t xml:space="preserve"> highlights another limit. Selecting help from a menu without a teacher is not equivalent to teacher-guided support.</w:t>
       </w:r>
@@ -1224,7 +1243,7 @@
         <w:fldChar w:fldCharType="begin"/>
       </w:r>
       <w:r>
-        <w:instrText xml:space="preserve"> ADDIN ZOTERO_ITEM CSL_CITATION {"citationID":"a1tkj32dg29","properties":{"unsorted":false,"formattedCitation":"(Hevner et al., 2004, p. 86, Table 2)","plainCitation":"(Hevner et al., 2004, p. 86, Table 2)","noteIndex":0},"citationItems":[{"id":115,"uris":["http://zotero.org/users/local/W3Vhviin/items/YYMUHPMN"],"itemData":{"id":115,"type":"article-journal","container-title":"MIS Quarterly","DOI":"10.2307/25148625","ISSN":"ISSN 0276-7783/ISSN 2162-9730","issue":"1","page":"75–105","source":"COinS","title":"Design science in information systems research","volume":"28","author":[{"family":"Hevner","given":"Alan"},{"family":"March","given":"Salvatore"},{"family":"Park","given":"Jinsoo"},{"family":"Ram","given":"Sudha"}],"issued":{"date-parts":[["2004",3,1]]}},"locator":"86","label":"page","suffix":", Table 2"}],"schema":"https://github.com/citation-style-language/schema/raw/master/csl-citation.json"} </w:instrText>
+        <w:instrText xml:space="preserve"> ADDIN ZOTERO_ITEM CSL_CITATION {"citationID":"a1tkj32dg29","properties":{"unsorted":false,"formattedCitation":"(Hevner et al., 2004, p. 86, Table 2)","plainCitation":"(Hevner et al., 2004, p. 86, Table 2)","noteIndex":0},"citationItems":[{"id":115,"uris":["http://zotero.org/users/local/W3Vhviin/items/YYMUHPMN"],"itemData":{"id":115,"type":"article-journal","container-title":"MIS Quarterly","DOI":"10.2307/25148625","ISSN":"ISSN 0276-7783/ISSN 2162-9730","issue":"1","page":"75–105","source":"COinS","title":"Design science in information systems research","volume":"28","author":[{"family":"Hevner","given":"A. R."},{"family":"March","given":"S. T."},{"family":"Park","given":"Jinsoo"},{"family":"Ram","given":"Sudha"}],"issued":{"date-parts":[["2004",3,1]]}},"locator":"86","label":"page","suffix":", Table 2"}],"schema":"https://github.com/citation-style-language/schema/raw/master/csl-citation.json"} </w:instrText>
       </w:r>
       <w:r>
         <w:fldChar w:fldCharType="separate"/>
@@ -1286,17 +1305,10 @@
         <w:t xml:space="preserve"> </w:t>
       </w:r>
       <w:r>
-        <w:rPr>
-          <w:rFonts w:cs="Myanmar Text"/>
-          <w:lang w:eastAsia="en-US"/>
-        </w:rPr>
-        <w:t>(Tran et al., 2026)</w:t>
-      </w:r>
-      <w:r>
         <w:fldChar w:fldCharType="begin"/>
       </w:r>
       <w:r>
-        <w:instrText xml:space="preserve"> ADDIN ZOTERO_ITEM CSL_CITATION {"citationID":"a2831e84dh0","properties":{"unsorted":false,"formattedCitation":"(Tran et al., 2026)","plainCitation":"","noteIndex":0},"citationItems":[{"id":86,"uris":["http://zotero.org/users/local/W3Vhviin/items/QTKBFM9B"],"itemData":{"id":86,"type":"article-journal","abstract":"Automatic terminology or term extraction (ATE) is a Natural Language Processing (NLP) task intended to automatically identify specialized terms present in domain-specific corpora. As units of knowledge in a specific field of expertise, extracted terms are not only beneficial for several terminographical tasks, but also support and improve several complex downstream tasks, e.g., information retrieval, machine translation, topic detection, and sentiment analysis. ATE systems and datasets annotated for the task at hand have been studied and developed for decades, but more recent approaches have increasingly involved novel neural systems. Despite a large amount of new research on ATE tasks, systematic survey studies covering novel neural approaches are lacking, especially when it comes to the usage of large-scale language models (LLMs). We present a comprehensive survey of neural approaches to ATE, focusing on transformer-based neural models and the recent generative approaches based on LLMs. The study also compares these systems and previous ML-based approaches, which employed feature engineering and non-neural supervised learning algorithms.","container-title":"ACM Computing Surveys","DOI":"10.1145/3787584","ISSN":"0360-0300","issue":"9","page":"226:1–226:35","source":"ACM Digital Library","title":"Recent advances in automatic term extraction: A comprehensive survey","title-short":"Recent Advances in Automatic Term Extraction","volume":"58","author":[{"family":"Tran","given":"Hanh Thi Hong"},{"family":"Martinc","given":"Matej"},{"family":"Caporusso","given":"Jaya"},{"family":"Delaunay","given":"Julien"},{"family":"Doucet","given":"Antoine"},{"family":"Pollak","given":"Senja"}],"issued":{"date-parts":[["2026",2,25]]}}}],"schema":"https://github.com/citation-style-language/schema/raw/master/csl-citation.json"} </w:instrText>
+        <w:instrText xml:space="preserve"> ADDIN ZOTERO_ITEM CSL_CITATION {"citationID":"a2831e84dh0","properties":{"unsorted":false,"formattedCitation":"(Tran et al., 2026)","plainCitation":"","noteIndex":0},"citationItems":[{"id":86,"uris":["http://zotero.org/users/local/W3Vhviin/items/QTKBFM9B"],"itemData":{"id":86,"type":"article-journal","abstract":"Automatic terminology or term extraction (ATE) is a Natural Language Processing (NLP) task intended to automatically identify specialized terms present in domain-specific corpora. As units of knowledge in a specific field of expertise, extracted terms are not only beneficial for several terminographical tasks, but also support and improve several complex downstream tasks, e.g., information retrieval, machine translation, topic detection, and sentiment analysis. ATE systems and datasets annotated for the task at hand have been studied and developed for decades, but more recent approaches have increasingly involved novel neural systems. Despite a large amount of new research on ATE tasks, systematic survey studies covering novel neural approaches are lacking, especially when it comes to the usage of large-scale language models (LLMs). We present a comprehensive survey of neural approaches to ATE, focusing on transformer-based neural models and the recent generative approaches based on LLMs. The study also compares these systems and previous ML-based approaches, which employed feature engineering and non-neural supervised learning algorithms.","container-title":"ACM Computing Surveys","DOI":"10.1145/3787584","ISSN":"0360-0300","issue":"9","note":"number: 226","source":"ACM Digital Library","title":"Recent advances in automatic term extraction: A comprehensive survey","title-short":"Recent Advances in Automatic Term Extraction","URL":"https://dl.acm.org/doi/10.1145/3787584","volume":"58","author":[{"family":"Tran","given":"Hanh Thi Hong"},{"family":"Martinc","given":"Matej"},{"family":"Caporusso","given":"Jaya"},{"family":"Delaunay","given":"Julien"},{"family":"Doucet","given":"Antoine"},{"family":"Pollak","given":"Senja"}],"accessed":{"date-parts":[["2026",8,7]]},"issued":{"date-parts":[["2026",2,25]]}}}],"schema":"https://github.com/citation-style-language/schema/raw/master/csl-citation.json"} </w:instrText>
       </w:r>
       <w:r>
         <w:fldChar w:fldCharType="separate"/>
@@ -1362,7 +1374,7 @@
         <w:fldChar w:fldCharType="begin"/>
       </w:r>
       <w:r>
-        <w:instrText xml:space="preserve"> ADDIN ZOTERO_ITEM CSL_CITATION {"citationID":"a9t1lhi6a7","properties":{"unsorted":false,"formattedCitation":"(Ji et al., 2024)","plainCitation":"(Ji et al., 2024)","noteIndex":0},"citationItems":[{"id":152,"uris":["http://zotero.org/users/local/W3Vhviin/items/6LYWIPG4"],"itemData":{"id":152,"type":"article-journal","abstract":"Natural Language Generation (NLG) has improved exponentially in recent years thanks to the development of sequence-to-sequence deep learning technologies such as Transformer-based language models. This advancement has led to more fluent and coherent NLG, leading to improved development in downstream tasks such as abstractive summarization, dialogue generation and data-to-text generation. However, it is also apparent that deep learning based generation is prone to hallucinate unintended text, which degrades the system performance and fails to meet user expectations in many real-world scenarios. To address this issue, many studies have been presented in measuring and mitigating hallucinated texts, but these have never been reviewed in a comprehensive manner before. In this survey, we thus provide a broad overview of the research progress and challenges in the hallucination problem in NLG. The survey is organized into two parts: (1) a general overview of metrics, mitigation methods, and future directions; (2) an overview of task-specific research progress on hallucinations in the following downstream tasks, namely abstractive summarization, dialogue generation, generative question answering, data-to-text generation, machine translation, and visual-language generation; and (3) hallucinations in large language models (LLMs). This survey serves to facilitate collaborative efforts among researchers in tackling the challenge of hallucinated texts in NLG.","container-title":"ACM Computing Surveys","DOI":"10.1145/3571730","ISSN":"0360-0300, 1557-7341","issue":"12","journalAbbreviation":"ACM Comput. Surv.","note":"arXiv:2202.03629 [cs.CL]","page":"1-38","source":"arXiv.org","title":"Survey of hallucination in natural language generation","volume":"55","author":[{"family":"Ji","given":"Ziwei"},{"family":"Lee","given":"Nayeon"},{"family":"Frieske","given":"Rita"},{"family":"Yu","given":"Tiezheng"},{"family":"Su","given":"Dan"},{"family":"Xu","given":"Yan"},{"family":"Ishii","given":"Etsuko"},{"family":"Bang","given":"Yejin"},{"family":"Chen","given":"Delong"},{"family":"Dai","given":"Wenliang"},{"family":"Chan","given":"Ho Shu"},{"family":"Madotto","given":"Andrea"},{"family":"Fung","given":"Pascale"}],"issued":{"date-parts":[["2024",7,14]]}}}],"schema":"https://github.com/citation-style-language/schema/raw/master/csl-citation.json"} </w:instrText>
+        <w:instrText xml:space="preserve"> ADDIN ZOTERO_ITEM CSL_CITATION {"citationID":"a26eeltai66","properties":{"unsorted":false,"formattedCitation":"(Ji et al., 2023)","plainCitation":"(Ji et al., 2023)","noteIndex":0},"citationItems":[{"id":164,"uris":["http://zotero.org/users/local/W3Vhviin/items/G2SVVUX3"],"itemData":{"id":164,"type":"article-journal","abstract":"Natural Language Generation (NLG) has improved exponentially in recent years thanks to the development of sequence-to-sequence deep learning technologies such as Transformer-based language models. This advancement has led to more fluent and coherent NLG, leading to improved development in downstream tasks such as abstractive summarization, dialogue generation, and data-to-text generation. However, it is also apparent that deep learning based generation is prone to hallucinate unintended text, which degrades the system performance and fails to meet user expectations in many real-world scenarios. To address this issue, many studies have been presented in measuring and mitigating hallucinated texts, but these have never been reviewed in a comprehensive manner before.In this survey, we thus provide a broad overview of the research progress and challenges in the hallucination problem in NLG. The survey is organized into two parts: (1) a general overview of metrics, mitigation methods, and future directions, and (2) an overview of task-specific research progress on hallucinations in the following downstream tasks, namely abstractive summarization, dialogue generation, generative question answering, data-to-text generation, and machine translation. This survey serves to facilitate collaborative efforts among researchers in tackling the challenge of hallucinated texts in NLG.","container-title":"ACM Computing Surveys","DOI":"10.1145/3571730","ISSN":"0360-0300","issue":"12","journalAbbreviation":"ACM Comput. Surv.","note":"number: 248","page":"248:1–248:38","source":"ACM Digital Library","title":"Survey of hallucination in natural language generation","volume":"55","author":[{"family":"Ji","given":"Ziwei"},{"family":"Lee","given":"Nayeon"},{"family":"Frieske","given":"Rita"},{"family":"Yu","given":"Tiezheng"},{"family":"Su","given":"Dan"},{"family":"Xu","given":"Yan"},{"family":"Ishii","given":"Etsuko"},{"family":"Bang","given":"Ye Jin"},{"family":"Madotto","given":"Andrea"},{"family":"Fung","given":"Pascale"}],"issued":{"date-parts":[["2023",3,3]]}}}],"schema":"https://github.com/citation-style-language/schema/raw/master/csl-citation.json"} </w:instrText>
       </w:r>
       <w:r>
         <w:fldChar w:fldCharType="separate"/>
@@ -1371,7 +1383,7 @@
         <w:rPr>
           <w:lang w:eastAsia="en-US"/>
         </w:rPr>
-        <w:t>(Ji et al., 2024)</w:t>
+        <w:t>(Ji et al., 2023)</w:t>
       </w:r>
       <w:r>
         <w:fldChar w:fldCharType="end"/>
@@ -1427,7 +1439,7 @@
         <w:fldChar w:fldCharType="begin"/>
       </w:r>
       <w:r>
-        <w:instrText xml:space="preserve"> ADDIN ZOTERO_ITEM CSL_CITATION {"citationID":"av37tqa3cp","properties":{"unsorted":false,"formattedCitation":"(Dunlosky &amp; Rawson, 2012)","plainCitation":"(Dunlosky &amp; Rawson, 2012)","noteIndex":0},"citationItems":[{"id":155,"uris":["http://zotero.org/users/local/W3Vhviin/items/6IEGB76B"],"itemData":{"id":155,"type":"article-journal","abstract":"The function of accurately monitoring one’s own learning is to support effective control of study that enhances learning. Although this link between monitoring accuracy and learning is intuitively plausible and is assumed by general theories of self-regulated learning, it has not received a great deal of empirical scrutiny and no study to date has examined the link between monitoring accuracy and longer-term retention. Across two studies, college students paced their study of key-term definitions (e.g., “Proactive interference: Information already stored in memory interferes with the learning of new information”). After all definitions were studied, participants completed practice cued recall tests (e.g., “What is proactive interference?”) in which they attempted to type the correct definition for each term. After each test trial, participants judged how much of their response was correct. These study-test-judgment trials continued until a definition was judged as correct three times. A final cued recall test occurred two days later. In Study 1, judgment accuracy was manipulated experimentally, and in Study 2, individual differences in accuracy were examined. In both studies, greater accuracy was associated with higher levels of retention, and this link could not be explained by differential feedback, effort during study, or trials to criterion. Results indicate that many students could benefit from interventions aimed at improving their skill at judging their learning.","collection-title":"Improving Self-Monitoring and Self-Regulation of Learning: From Cognitive Psychology to the Classroom","container-title":"Learning and Instruction","DOI":"10.1016/j.learninstruc.2011.08.003","ISSN":"0959-4752","issue":"4","journalAbbreviation":"Learning and Instruction","page":"271-280","source":"ScienceDirect","title":"Overconfidence produces underachievement: Inaccurate self evaluations undermine students’ learning and retention","title-short":"Overconfidence produces underachievement","volume":"22","author":[{"family":"Dunlosky","given":"John"},{"family":"Rawson","given":"Katherine A."}],"issued":{"date-parts":[["2012",8,1]]}}}],"schema":"https://github.com/citation-style-language/schema/raw/master/csl-citation.json"} </w:instrText>
+        <w:instrText xml:space="preserve"> ADDIN ZOTERO_ITEM CSL_CITATION {"citationID":"av37tqa3cp","properties":{"unsorted":false,"formattedCitation":"(Dunlosky &amp; Rawson, 2012)","plainCitation":"(Dunlosky &amp; Rawson, 2012)","noteIndex":0},"citationItems":[{"id":155,"uris":["http://zotero.org/users/local/W3Vhviin/items/6IEGB76B"],"itemData":{"id":155,"type":"article-journal","abstract":"The function of accurately monitoring one’s own learning is to support effective control of study that enhances learning. Although this link between monitoring accuracy and learning is intuitively plausible and is assumed by general theories of self-regulated learning, it has not received a great deal of empirical scrutiny and no study to date has examined the link between monitoring accuracy and longer-term retention. Across two studies, college students paced their study of key-term definitions (e.g., “Proactive interference: Information already stored in memory interferes with the learning of new information”). After all definitions were studied, participants completed practice cued recall tests (e.g., “What is proactive interference?”) in which they attempted to type the correct definition for each term. After each test trial, participants judged how much of their response was correct. These study-test-judgment trials continued until a definition was judged as correct three times. A final cued recall test occurred two days later. In Study 1, judgment accuracy was manipulated experimentally, and in Study 2, individual differences in accuracy were examined. In both studies, greater accuracy was associated with higher levels of retention, and this link could not be explained by differential feedback, effort during study, or trials to criterion. Results indicate that many students could benefit from interventions aimed at improving their skill at judging their learning.","container-title":"Learning and Instruction","DOI":"10.1016/j.learninstruc.2011.08.003","ISSN":"0959-4752","issue":"4","journalAbbreviation":"Learning and Instruction","page":"271-280","source":"ScienceDirect","title":"Overconfidence produces underachievement: Inaccurate self evaluations undermine students’ learning and retention","title-short":"Overconfidence produces underachievement","volume":"22","author":[{"family":"Dunlosky","given":"John"},{"family":"Rawson","given":"Katherine A."}],"issued":{"date-parts":[["2012",8,1]]}}}],"schema":"https://github.com/citation-style-language/schema/raw/master/csl-citation.json"} </w:instrText>
       </w:r>
       <w:r>
         <w:fldChar w:fldCharType="separate"/>
@@ -2876,6 +2888,9 @@
         <w:tc>
           <w:tcPr>
             <w:tcW w:w="1781" w:type="dxa"/>
+            <w:tcBorders>
+              <w:bottom w:val="single" w:sz="4" w:space="0" w:color="auto"/>
+            </w:tcBorders>
             <w:hideMark/>
           </w:tcPr>
           <w:p>
@@ -2898,6 +2913,9 @@
         <w:tc>
           <w:tcPr>
             <w:tcW w:w="2906" w:type="dxa"/>
+            <w:tcBorders>
+              <w:bottom w:val="single" w:sz="4" w:space="0" w:color="auto"/>
+            </w:tcBorders>
             <w:hideMark/>
           </w:tcPr>
           <w:p>
@@ -2920,6 +2938,9 @@
         <w:tc>
           <w:tcPr>
             <w:tcW w:w="2775" w:type="dxa"/>
+            <w:tcBorders>
+              <w:bottom w:val="single" w:sz="4" w:space="0" w:color="auto"/>
+            </w:tcBorders>
             <w:hideMark/>
           </w:tcPr>
           <w:p>
@@ -2942,6 +2963,9 @@
         <w:tc>
           <w:tcPr>
             <w:tcW w:w="1898" w:type="dxa"/>
+            <w:tcBorders>
+              <w:bottom w:val="single" w:sz="4" w:space="0" w:color="auto"/>
+            </w:tcBorders>
             <w:hideMark/>
           </w:tcPr>
           <w:p>
@@ -2969,6 +2993,9 @@
         <w:tc>
           <w:tcPr>
             <w:tcW w:w="1781" w:type="dxa"/>
+            <w:tcBorders>
+              <w:bottom w:val="single" w:sz="4" w:space="0" w:color="auto"/>
+            </w:tcBorders>
             <w:hideMark/>
           </w:tcPr>
           <w:p>
@@ -2991,6 +3018,9 @@
         <w:tc>
           <w:tcPr>
             <w:tcW w:w="2906" w:type="dxa"/>
+            <w:tcBorders>
+              <w:bottom w:val="single" w:sz="4" w:space="0" w:color="auto"/>
+            </w:tcBorders>
             <w:hideMark/>
           </w:tcPr>
           <w:p>
@@ -3013,6 +3043,9 @@
         <w:tc>
           <w:tcPr>
             <w:tcW w:w="2775" w:type="dxa"/>
+            <w:tcBorders>
+              <w:bottom w:val="single" w:sz="4" w:space="0" w:color="auto"/>
+            </w:tcBorders>
             <w:hideMark/>
           </w:tcPr>
           <w:p>
@@ -3035,6 +3068,9 @@
         <w:tc>
           <w:tcPr>
             <w:tcW w:w="1898" w:type="dxa"/>
+            <w:tcBorders>
+              <w:bottom w:val="single" w:sz="4" w:space="0" w:color="auto"/>
+            </w:tcBorders>
             <w:hideMark/>
           </w:tcPr>
           <w:p>
@@ -3062,6 +3098,9 @@
         <w:tc>
           <w:tcPr>
             <w:tcW w:w="1781" w:type="dxa"/>
+            <w:tcBorders>
+              <w:top w:val="single" w:sz="4" w:space="0" w:color="auto"/>
+            </w:tcBorders>
             <w:hideMark/>
           </w:tcPr>
           <w:p>
@@ -3085,6 +3124,9 @@
         <w:tc>
           <w:tcPr>
             <w:tcW w:w="2906" w:type="dxa"/>
+            <w:tcBorders>
+              <w:top w:val="single" w:sz="4" w:space="0" w:color="auto"/>
+            </w:tcBorders>
             <w:hideMark/>
           </w:tcPr>
           <w:p>
@@ -3107,6 +3149,9 @@
         <w:tc>
           <w:tcPr>
             <w:tcW w:w="2775" w:type="dxa"/>
+            <w:tcBorders>
+              <w:top w:val="single" w:sz="4" w:space="0" w:color="auto"/>
+            </w:tcBorders>
             <w:hideMark/>
           </w:tcPr>
           <w:p>
@@ -3129,6 +3174,9 @@
         <w:tc>
           <w:tcPr>
             <w:tcW w:w="1898" w:type="dxa"/>
+            <w:tcBorders>
+              <w:top w:val="single" w:sz="4" w:space="0" w:color="auto"/>
+            </w:tcBorders>
             <w:hideMark/>
           </w:tcPr>
           <w:p>
@@ -4403,14 +4451,7 @@
                 <w:sz w:val="20"/>
                 <w:szCs w:val="20"/>
               </w:rPr>
-              <w:t>Localized</w:t>
-            </w:r>
-            <w:r>
-              <w:rPr>
-                <w:sz w:val="20"/>
-                <w:szCs w:val="20"/>
-              </w:rPr>
-              <w:t xml:space="preserve"> error and recovery action understandable</w:t>
+              <w:t>Localized error and recovery action understandable</w:t>
             </w:r>
           </w:p>
         </w:tc>
@@ -4771,21 +4812,65 @@
       <w:r>
         <w:t xml:space="preserve">Burmese meaning and clarity were checked in 104 matching English–Burmese passages from 32 selected outputs. Every delivered main concept and all three language-help cases were included. Categories were adapted from </w:t>
       </w:r>
-      <w:hyperlink r:id="rId9">
-        <w:r>
-          <w:t>Freitag et al. (2021)</w:t>
-        </w:r>
-      </w:hyperlink>
+      <w:r>
+        <w:t>Freitag et al.</w:t>
+      </w:r>
+      <w:r>
+        <w:t xml:space="preserve"> </w:t>
+      </w:r>
+      <w:r>
+        <w:fldChar w:fldCharType="begin"/>
+      </w:r>
+      <w:r>
+        <w:instrText xml:space="preserve"> ADDIN ZOTERO_ITEM CSL_CITATION {"citationID":"a1d4vqsldh8","properties":{"unsorted":false,"formattedCitation":"(2021)","plainCitation":"(2021)","noteIndex":0},"citationItems":[{"id":158,"uris":["http://zotero.org/users/local/W3Vhviin/items/JQ4MDKJ9"],"itemData":{"id":158,"type":"article-journal","abstract":"Human evaluation of modern high-quality machine translation systems is a difficult problem, and there is increasing evidence that inadequate evaluation procedures can lead to erroneous conclusions. While there has been considerable research on human evaluation, the field still lacks a commonly accepted standard procedure. As a step toward this goal, we propose an evaluation methodology grounded in explicit error analysis, based on the Multidimensional Quality Metrics (MQM) framework. We carry out the largest MQM research study to date, scoring the outputs of top systems from the WMT 2020 shared task in two language pairs using annotations provided by professional translators with access to full document context. We analyze the resulting data extensively, finding among other results a substantially different ranking of evaluated systems from the one established by the WMT crowd workers, exhibiting a clear preference for human over machine output. Surprisingly, we also find that automatic metrics based on pre-trained embeddings can outperform human crowd workers. We make our corpus publicly available for further research.","container-title":"Transactions of the Association for Computational Linguistics","DOI":"10.1162/tacl_a_00437","page":"1460–1474","publisher":"MIT Press","publisher-place":"Cambridge, MA","source":"ACLWeb","title":"Experts, errors, and context: A large-scale study of human evaluation for machine translation","title-short":"Experts, Errors, and Context","volume":"9","author":[{"family":"Freitag","given":"Markus"},{"family":"Foster","given":"George"},{"family":"Grangier","given":"David"},{"family":"Ratnakar","given":"Viresh"},{"family":"Tan","given":"Qijun"},{"family":"Macherey","given":"Wolfgang"}],"editor":[{"family":"Roark","given":"Brian"},{"family":"Nenkova","given":"Ani"}],"issued":{"date-parts":[["2021"]]}},"suppress-author":true}],"schema":"https://github.com/citation-style-language/schema/raw/master/csl-citation.json"} </w:instrText>
+      </w:r>
+      <w:r>
+        <w:fldChar w:fldCharType="separate"/>
+      </w:r>
+      <w:r>
+        <w:rPr>
+          <w:lang w:eastAsia="en-US"/>
+        </w:rPr>
+        <w:t>(2021)</w:t>
+      </w:r>
+      <w:r>
+        <w:fldChar w:fldCharType="end"/>
+      </w:r>
       <w:r>
         <w:t xml:space="preserve"> and the </w:t>
       </w:r>
-      <w:hyperlink r:id="rId10">
-        <w:r>
-          <w:t>MQM Council (n.d.)</w:t>
-        </w:r>
-      </w:hyperlink>
-      <w:r>
-        <w:t>. Unexplained English and problems shared by both languages were added as categories. Scientific references supported meaning checks (Table C5).</w:t>
+      <w:r>
+        <w:t>MQM Council</w:t>
+      </w:r>
+      <w:r>
+        <w:t xml:space="preserve"> </w:t>
+      </w:r>
+      <w:r>
+        <w:fldChar w:fldCharType="begin"/>
+      </w:r>
+      <w:r>
+        <w:instrText xml:space="preserve"> ADDIN ZOTERO_ITEM CSL_CITATION {"citationID":"a195h4qh91j","properties":{"unsorted":false,"formattedCitation":"(n.d.)","plainCitation":"(n.d.)","noteIndex":0},"citationItems":[{"id":162,"uris":["http://zotero.org/users/local/W3Vhviin/items/DWUUQ7KS"],"itemData":{"id":162,"type":"webpage","abstract":"The MQM-Core error typology in interactive tree view: seven high-level error dimensions with their subtypes, definitions, and examples. Click any category to unfold it.","language":"en-US","title":"The MQM core typology","URL":"https://www.themqm.org/mqm-pillars/the-mqm-core-typology/","author":[{"literal":"MQM Council"}],"accessed":{"date-parts":[["2026",10,6]]}},"suppress-author":true}],"schema":"https://github.com/citation-style-language/schema/raw/master/csl-citation.json"} </w:instrText>
+      </w:r>
+      <w:r>
+        <w:fldChar w:fldCharType="separate"/>
+      </w:r>
+      <w:r>
+        <w:rPr>
+          <w:lang w:eastAsia="en-US"/>
+        </w:rPr>
+        <w:t>(n.d.)</w:t>
+      </w:r>
+      <w:r>
+        <w:fldChar w:fldCharType="end"/>
+      </w:r>
+      <w:r>
+        <w:t xml:space="preserve">. Unexplained English and problems shared by both languages were added as categories. </w:t>
+      </w:r>
+      <w:r>
+        <w:t>Examples of the assessed meaning and terminology issues are presented in Table C5</w:t>
+      </w:r>
+      <w:r>
+        <w:t>.</w:t>
       </w:r>
     </w:p>
     <w:p>
@@ -4802,7 +4887,10 @@
         <w:t xml:space="preserve">Four issues across three outputs were labelled major and 27 </w:t>
       </w:r>
       <w:r>
-        <w:t>minors</w:t>
+        <w:t>minor</w:t>
+      </w:r>
+      <w:r>
+        <w:t xml:space="preserve"> issues</w:t>
       </w:r>
       <w:r>
         <w:t>. Major issues changed or seriously obscured scientific meaning. Minor issues reduced clarity but left meaning recoverable. Ten concerns shared by both languages were not counted as translation errors (Tables C4–C5). Gravity and ion errors explain existing fail ratings. Unclear pH wording was labelled major in one passage, but the output remained partial. Original totals of 18 pass, 71 partial and two fail were unchanged.</w:t>
@@ -4891,7 +4979,7 @@
         <w:fldChar w:fldCharType="begin"/>
       </w:r>
       <w:r>
-        <w:instrText xml:space="preserve"> ADDIN ZOTERO_ITEM CSL_CITATION {"citationID":"a2klvsvk9m3","properties":{"unsorted":false,"formattedCitation":"(2004)","plainCitation":"(2004)","noteIndex":0},"citationItems":[{"id":115,"uris":["http://zotero.org/users/local/W3Vhviin/items/YYMUHPMN"],"itemData":{"id":115,"type":"article-journal","container-title":"MIS Quarterly","DOI":"10.2307/25148625","ISSN":"ISSN 0276-7783/ISSN 2162-9730","issue":"1","page":"75–105","source":"COinS","title":"Design science in information systems research","volume":"28","author":[{"family":"Hevner","given":"Alan"},{"family":"March","given":"Salvatore"},{"family":"Park","given":"Jinsoo"},{"family":"Ram","given":"Sudha"}],"issued":{"date-parts":[["2004",3,1]]}},"suppress-author":true}],"schema":"https://github.com/citation-style-language/schema/raw/master/csl-citation.json"} </w:instrText>
+        <w:instrText xml:space="preserve"> ADDIN ZOTERO_ITEM CSL_CITATION {"citationID":"a2klvsvk9m3","properties":{"unsorted":false,"formattedCitation":"(2004)","plainCitation":"(2004)","noteIndex":0},"citationItems":[{"id":115,"uris":["http://zotero.org/users/local/W3Vhviin/items/YYMUHPMN"],"itemData":{"id":115,"type":"article-journal","container-title":"MIS Quarterly","DOI":"10.2307/25148625","ISSN":"ISSN 0276-7783/ISSN 2162-9730","issue":"1","page":"75–105","source":"COinS","title":"Design science in information systems research","volume":"28","author":[{"family":"Hevner","given":"A. R."},{"family":"March","given":"S. T."},{"family":"Park","given":"Jinsoo"},{"family":"Ram","given":"Sudha"}],"issued":{"date-parts":[["2004",3,1]]}},"suppress-author":true}],"schema":"https://github.com/citation-style-language/schema/raw/master/csl-citation.json"} </w:instrText>
       </w:r>
       <w:r>
         <w:fldChar w:fldCharType="separate"/>
@@ -4933,7 +5021,11 @@
         <w:t>.</w:t>
       </w:r>
       <w:r>
-        <w:t xml:space="preserve"> Whether support matches learner competence cannot be established from self-report or history</w:t>
+        <w:t xml:space="preserve"> Whether support matches learner competence cannot be </w:t>
+      </w:r>
+      <w:r>
+        <w:lastRenderedPageBreak/>
+        <w:t>established from self-report or history</w:t>
       </w:r>
       <w:r>
         <w:t xml:space="preserve"> </w:t>
@@ -4960,11 +5052,7 @@
         <w:t xml:space="preserve">. </w:t>
       </w:r>
       <w:r>
-        <w:t xml:space="preserve">Controls were introduced in response </w:t>
-      </w:r>
-      <w:r>
-        <w:lastRenderedPageBreak/>
-        <w:t>to generated-content risks</w:t>
+        <w:t>Controls were introduced in response to generated-content risks</w:t>
       </w:r>
       <w:r>
         <w:t xml:space="preserve"> </w:t>
@@ -4973,7 +5061,7 @@
         <w:fldChar w:fldCharType="begin"/>
       </w:r>
       <w:r>
-        <w:instrText xml:space="preserve"> ADDIN ZOTERO_ITEM CSL_CITATION {"citationID":"at3o8mdq0d","properties":{"unsorted":false,"formattedCitation":"(Ji et al., 2024)","plainCitation":"(Ji et al., 2024)","noteIndex":0},"citationItems":[{"id":152,"uris":["http://zotero.org/users/local/W3Vhviin/items/6LYWIPG4"],"itemData":{"id":152,"type":"article-journal","abstract":"Natural Language Generation (NLG) has improved exponentially in recent years thanks to the development of sequence-to-sequence deep learning technologies such as Transformer-based language models. This advancement has led to more fluent and coherent NLG, leading to improved development in downstream tasks such as abstractive summarization, dialogue generation and data-to-text generation. However, it is also apparent that deep learning based generation is prone to hallucinate unintended text, which degrades the system performance and fails to meet user expectations in many real-world scenarios. To address this issue, many studies have been presented in measuring and mitigating hallucinated texts, but these have never been reviewed in a comprehensive manner before. In this survey, we thus provide a broad overview of the research progress and challenges in the hallucination problem in NLG. The survey is organized into two parts: (1) a general overview of metrics, mitigation methods, and future directions; (2) an overview of task-specific research progress on hallucinations in the following downstream tasks, namely abstractive summarization, dialogue generation, generative question answering, data-to-text generation, machine translation, and visual-language generation; and (3) hallucinations in large language models (LLMs). This survey serves to facilitate collaborative efforts among researchers in tackling the challenge of hallucinated texts in NLG.","container-title":"ACM Computing Surveys","DOI":"10.1145/3571730","ISSN":"0360-0300, 1557-7341","issue":"12","journalAbbreviation":"ACM Comput. Surv.","note":"arXiv:2202.03629 [cs.CL]","page":"1-38","source":"arXiv.org","title":"Survey of hallucination in natural language generation","volume":"55","author":[{"family":"Ji","given":"Ziwei"},{"family":"Lee","given":"Nayeon"},{"family":"Frieske","given":"Rita"},{"family":"Yu","given":"Tiezheng"},{"family":"Su","given":"Dan"},{"family":"Xu","given":"Yan"},{"family":"Ishii","given":"Etsuko"},{"family":"Bang","given":"Yejin"},{"family":"Chen","given":"Delong"},{"family":"Dai","given":"Wenliang"},{"family":"Chan","given":"Ho Shu"},{"family":"Madotto","given":"Andrea"},{"family":"Fung","given":"Pascale"}],"issued":{"date-parts":[["2024",7,14]]}}}],"schema":"https://github.com/citation-style-language/schema/raw/master/csl-citation.json"} </w:instrText>
+        <w:instrText xml:space="preserve"> ADDIN ZOTERO_ITEM CSL_CITATION {"citationID":"a2gn3bah6cj","properties":{"unsorted":false,"formattedCitation":"(Ji et al., 2023)","plainCitation":"(Ji et al., 2023)","noteIndex":0},"citationItems":[{"id":164,"uris":["http://zotero.org/users/local/W3Vhviin/items/G2SVVUX3"],"itemData":{"id":164,"type":"article-journal","abstract":"Natural Language Generation (NLG) has improved exponentially in recent years thanks to the development of sequence-to-sequence deep learning technologies such as Transformer-based language models. This advancement has led to more fluent and coherent NLG, leading to improved development in downstream tasks such as abstractive summarization, dialogue generation, and data-to-text generation. However, it is also apparent that deep learning based generation is prone to hallucinate unintended text, which degrades the system performance and fails to meet user expectations in many real-world scenarios. To address this issue, many studies have been presented in measuring and mitigating hallucinated texts, but these have never been reviewed in a comprehensive manner before.In this survey, we thus provide a broad overview of the research progress and challenges in the hallucination problem in NLG. The survey is organized into two parts: (1) a general overview of metrics, mitigation methods, and future directions, and (2) an overview of task-specific research progress on hallucinations in the following downstream tasks, namely abstractive summarization, dialogue generation, generative question answering, data-to-text generation, and machine translation. This survey serves to facilitate collaborative efforts among researchers in tackling the challenge of hallucinated texts in NLG.","container-title":"ACM Computing Surveys","DOI":"10.1145/3571730","ISSN":"0360-0300","issue":"12","journalAbbreviation":"ACM Comput. Surv.","note":"number: 248","page":"248:1–248:38","source":"ACM Digital Library","title":"Survey of hallucination in natural language generation","volume":"55","author":[{"family":"Ji","given":"Ziwei"},{"family":"Lee","given":"Nayeon"},{"family":"Frieske","given":"Rita"},{"family":"Yu","given":"Tiezheng"},{"family":"Su","given":"Dan"},{"family":"Xu","given":"Yan"},{"family":"Ishii","given":"Etsuko"},{"family":"Bang","given":"Ye Jin"},{"family":"Madotto","given":"Andrea"},{"family":"Fung","given":"Pascale"}],"issued":{"date-parts":[["2023",3,3]]}}}],"schema":"https://github.com/citation-style-language/schema/raw/master/csl-citation.json"} </w:instrText>
       </w:r>
       <w:r>
         <w:fldChar w:fldCharType="separate"/>
@@ -4982,7 +5070,7 @@
         <w:rPr>
           <w:lang w:eastAsia="en-US"/>
         </w:rPr>
-        <w:t>(Ji et al., 2024)</w:t>
+        <w:t>(Ji et al., 2023)</w:t>
       </w:r>
       <w:r>
         <w:fldChar w:fldCharType="end"/>
@@ -5061,8 +5149,8 @@
           <w:szCs w:val="22"/>
         </w:rPr>
         <w:drawing>
-          <wp:inline distT="0" distB="0" distL="0" distR="0" wp14:anchorId="2A04995D" wp14:editId="6F0557EA">
-            <wp:extent cx="2755900" cy="4953000"/>
+          <wp:inline distT="0" distB="0" distL="0" distR="0" wp14:anchorId="2A04995D" wp14:editId="68A131B8">
+            <wp:extent cx="3081867" cy="5538839"/>
             <wp:effectExtent l="0" t="0" r="0" b="0"/>
             <wp:docPr id="757350129" name="Picture 1"/>
             <wp:cNvGraphicFramePr>
@@ -5076,7 +5164,7 @@
                     <pic:cNvPicPr/>
                   </pic:nvPicPr>
                   <pic:blipFill>
-                    <a:blip r:embed="rId11" cstate="print">
+                    <a:blip r:embed="rId8" cstate="print">
                       <a:extLst>
                         <a:ext uri="{28A0092B-C50C-407E-A947-70E740481C1C}">
                           <a14:useLocalDpi xmlns:a14="http://schemas.microsoft.com/office/drawing/2010/main" val="0"/>
@@ -5090,7 +5178,7 @@
                   <pic:spPr>
                     <a:xfrm>
                       <a:off x="0" y="0"/>
-                      <a:ext cx="2755900" cy="4953000"/>
+                      <a:ext cx="3113415" cy="5595538"/>
                     </a:xfrm>
                     <a:prstGeom prst="rect">
                       <a:avLst/>
@@ -5130,11 +5218,7 @@
         <w:jc w:val="both"/>
       </w:pPr>
       <w:r>
-        <w:t xml:space="preserve">Two adaptations, four response events, one follow-up and completion were recorded in a photosynthesis walkthrough. Fifteen technical checks passed (Figure 2, Tables G1–G2). The adaptation </w:t>
-      </w:r>
-      <w:r>
-        <w:lastRenderedPageBreak/>
-        <w:t>limit and post-completion behavior were checked through application programming interface (API) requests rather than learner clicks. Stored state was restored through Resume/Review. Content remains provisionally partial because of overly broad scientific wording, unexplained nontechnical English and similar examples.</w:t>
+        <w:t>Two adaptations, four response events, one follow-up and completion were recorded in a photosynthesis walkthrough. Fifteen technical checks passed (Figure 2, Tables G1–G2). The adaptation limit and post-completion behavior were checked through application programming interface (API) requests rather than learner clicks. Stored state was restored through Resume/Review. Content remains provisionally partial because of overly broad scientific wording, unexplained nontechnical English and similar examples.</w:t>
       </w:r>
     </w:p>
     <w:p>
@@ -5615,6 +5699,7 @@
                 <w:sz w:val="20"/>
                 <w:szCs w:val="20"/>
               </w:rPr>
+              <w:lastRenderedPageBreak/>
               <w:t>Bounds analysis</w:t>
             </w:r>
           </w:p>
@@ -5708,7 +5793,6 @@
                 <w:sz w:val="20"/>
                 <w:szCs w:val="20"/>
               </w:rPr>
-              <w:lastRenderedPageBreak/>
               <w:t>Simulation</w:t>
             </w:r>
           </w:p>
@@ -6692,68 +6776,6 @@
       <w:r>
         <w:t>Twenty-four documented chains linked problems, requirements, questions, objectives and artefacts to evaluation criteria and findings. Methods and outcomes are mapped to the questions in Tables 2–4. The problems, requirements and objectives behind each conclusion are shown in Table 5. All three questions remain partially supported. A complete mapping does not mean that every requirement was met.</w:t>
       </w:r>
-    </w:p>
-    <w:p>
-      <w:pPr>
-        <w:spacing w:line="360" w:lineRule="auto"/>
-      </w:pPr>
-    </w:p>
-    <w:p>
-      <w:pPr>
-        <w:spacing w:line="360" w:lineRule="auto"/>
-        <w:jc w:val="both"/>
-      </w:pPr>
-      <w:r>
-        <w:t>For RQ1, a reasonable approach to terminology was provided through context interpretation and selective bilingual support. Concept-correction and language-help routes were implemented. However, corrections returning unchanged interpretations were rejected, and Burmese terminology errors remained. Reliable automatic term extraction and reduced language barriers were not established.</w:t>
-      </w:r>
-    </w:p>
-    <w:p>
-      <w:pPr>
-        <w:spacing w:line="360" w:lineRule="auto"/>
-      </w:pPr>
-    </w:p>
-    <w:p>
-      <w:pPr>
-        <w:spacing w:line="360" w:lineRule="auto"/>
-        <w:jc w:val="both"/>
-      </w:pPr>
-      <w:r>
-        <w:lastRenderedPageBreak/>
-        <w:t>For RQ2, support beyond word-for-word translation was provided through core explanations, examples, reflection and hints. Content quality was limited by incorrect definitions and repeated examples. Understanding and retention were not measured. Explanations were made available, but whether learners understood them was not established.</w:t>
-      </w:r>
-    </w:p>
-    <w:p>
-      <w:pPr>
-        <w:spacing w:line="360" w:lineRule="auto"/>
-      </w:pPr>
-    </w:p>
-    <w:p>
-      <w:pPr>
-        <w:spacing w:line="360" w:lineRule="auto"/>
-        <w:jc w:val="both"/>
-      </w:pPr>
-      <w:r>
-        <w:t>For RQ3, predefined routes were selected from self-reported need, generation was limited and response history was stored. These controls were supported by simultaneous-request and session-transition tests. Support matched to assessed competence, appropriate withdrawal, transfer of responsibility and an ideal two-adaptation limit were not demonstrated. Self-report, reaching the adaptation limit and choosing Finish are different actions. Completing a session does not show mastery.</w:t>
-      </w:r>
-    </w:p>
-    <w:p>
-      <w:pPr>
-        <w:spacing w:line="360" w:lineRule="auto"/>
-      </w:pPr>
-    </w:p>
-    <w:p>
-      <w:pPr>
-        <w:spacing w:line="360" w:lineRule="auto"/>
-        <w:jc w:val="both"/>
-      </w:pPr>
-      <w:r>
-        <w:t>Terminology and meaning problems in the bilingual assessment further limit RQ1 and RQ2. Unclear wording and scientific concerns shared by both languages remained after language help, limiting claims about adaptation quality under RQ3. All three conclusions remain partially supported. Earlier ratings are not independently confirmed by reassessing the same outputs.</w:t>
-      </w:r>
-    </w:p>
-    <w:p>
-      <w:pPr>
-        <w:spacing w:line="360" w:lineRule="auto"/>
-      </w:pPr>
     </w:p>
     <w:p>
       <w:pPr>
@@ -6773,6 +6795,7 @@
           <w:sz w:val="22"/>
           <w:szCs w:val="22"/>
         </w:rPr>
+        <w:lastRenderedPageBreak/>
         <w:t>Table 5</w:t>
       </w:r>
     </w:p>
@@ -7035,7 +7058,6 @@
                 <w:sz w:val="20"/>
                 <w:szCs w:val="20"/>
               </w:rPr>
-              <w:lastRenderedPageBreak/>
               <w:t>Translation alone does not explain STEM concepts</w:t>
             </w:r>
           </w:p>
@@ -7229,6 +7251,63 @@
     </w:p>
     <w:p>
       <w:pPr>
+        <w:spacing w:line="360" w:lineRule="auto"/>
+        <w:jc w:val="both"/>
+      </w:pPr>
+      <w:r>
+        <w:t>For RQ1, a reasonable approach to terminology was provided through context interpretation and selective bilingual support. Concept-correction and language-help routes were implemented. However, corrections returning unchanged interpretations were rejected, and Burmese terminology errors remained. Reliable automatic term extraction and reduced language barriers were not established.</w:t>
+      </w:r>
+    </w:p>
+    <w:p>
+      <w:pPr>
+        <w:spacing w:line="360" w:lineRule="auto"/>
+      </w:pPr>
+    </w:p>
+    <w:p>
+      <w:pPr>
+        <w:spacing w:line="360" w:lineRule="auto"/>
+        <w:jc w:val="both"/>
+      </w:pPr>
+      <w:r>
+        <w:lastRenderedPageBreak/>
+        <w:t>For RQ2, support beyond word-for-word translation was provided through core explanations, examples, reflection and hints. Content quality was limited by incorrect definitions and repeated examples. Understanding and retention were not measured. Explanations were made available, but whether learners understood them was not established.</w:t>
+      </w:r>
+    </w:p>
+    <w:p>
+      <w:pPr>
+        <w:spacing w:line="360" w:lineRule="auto"/>
+      </w:pPr>
+    </w:p>
+    <w:p>
+      <w:pPr>
+        <w:spacing w:line="360" w:lineRule="auto"/>
+        <w:jc w:val="both"/>
+      </w:pPr>
+      <w:r>
+        <w:t>For RQ3, predefined routes were selected from self-reported need, generation was limited and response history was stored. These controls were supported by simultaneous-request and session-transition tests. Support matched to assessed competence, appropriate withdrawal, transfer of responsibility and an ideal two-adaptation limit were not demonstrated. Self-report, reaching the adaptation limit and choosing Finish are different actions. Completing a session does not show mastery.</w:t>
+      </w:r>
+    </w:p>
+    <w:p>
+      <w:pPr>
+        <w:spacing w:line="360" w:lineRule="auto"/>
+      </w:pPr>
+    </w:p>
+    <w:p>
+      <w:pPr>
+        <w:spacing w:line="360" w:lineRule="auto"/>
+        <w:jc w:val="both"/>
+      </w:pPr>
+      <w:r>
+        <w:t>Terminology and meaning problems in the bilingual assessment further limit RQ1 and RQ2. Unclear wording and scientific concerns shared by both languages remained after language help, limiting claims about adaptation quality under RQ3. All three conclusions remain partially supported. Earlier ratings are not independently confirmed by reassessing the same outputs.</w:t>
+      </w:r>
+    </w:p>
+    <w:p>
+      <w:pPr>
+        <w:spacing w:line="360" w:lineRule="auto"/>
+      </w:pPr>
+    </w:p>
+    <w:p>
+      <w:pPr>
         <w:pStyle w:val="Heading2"/>
         <w:spacing w:line="360" w:lineRule="auto"/>
       </w:pPr>
@@ -7283,11 +7362,7 @@
         <w:jc w:val="both"/>
       </w:pPr>
       <w:r>
-        <w:t xml:space="preserve">No learner study, independent expert review, assessment of suitable support levels or full accessibility audit was conducted. Recovery from preference-save failures and whether support differed from earlier explanations in two cases remain untested. Some literature comparisons used abstracts or summaries, which do not validate Burmese terms. Concurrent requests can make extra provider </w:t>
-      </w:r>
-      <w:r>
-        <w:lastRenderedPageBreak/>
-        <w:t>calls despite the two-adaptation limit. Cancellation can also exceed the configured twenty seconds. Better content than other systems and improved learning were not demonstrated.</w:t>
+        <w:t>No learner study, independent expert review, assessment of suitable support levels or full accessibility audit was conducted. Recovery from preference-save failures and whether support differed from earlier explanations in two cases remain untested. Some literature comparisons used abstracts or summaries, which do not validate Burmese terms. Concurrent requests can make extra provider calls despite the two-adaptation limit. Cancellation can also exceed the configured twenty seconds. Better content than other systems and improved learning were not demonstrated.</w:t>
       </w:r>
     </w:p>
     <w:p>
@@ -7355,6 +7430,16 @@
       <w:r>
         <w:t>Content errors, delivery failures and interface problems should be corrected in future work. Each revised version should be recorded and affected tests rerun. Independent content review and studies with learners are then needed to assess usefulness, learning and whether support matches learner needs.</w:t>
       </w:r>
+    </w:p>
+    <w:p>
+      <w:pPr>
+        <w:spacing w:line="360" w:lineRule="auto"/>
+      </w:pPr>
+    </w:p>
+    <w:p>
+      <w:pPr>
+        <w:spacing w:line="360" w:lineRule="auto"/>
+      </w:pPr>
     </w:p>
     <w:p>
       <w:pPr>
@@ -7442,7 +7527,7 @@
           <w:iCs/>
           <w:lang w:eastAsia="en-US"/>
         </w:rPr>
-        <w:t>Learning and Instruction, Improving Self-Monitoring and Self-Regulation of Learning: From Cognitive Psychology to the Classroom</w:t>
+        <w:t>Learning and Instruction</w:t>
       </w:r>
       <w:r>
         <w:rPr>
@@ -7476,6 +7561,48 @@
         <w:rPr>
           <w:lang w:eastAsia="en-US"/>
         </w:rPr>
+        <w:t xml:space="preserve">Freitag, M., Foster, G., Grangier, D., Ratnakar, V., Tan, Q., &amp; Macherey, W. (2021). Experts, errors, and context: A large-scale study of human evaluation for machine translation. </w:t>
+      </w:r>
+      <w:r>
+        <w:rPr>
+          <w:i/>
+          <w:iCs/>
+          <w:lang w:eastAsia="en-US"/>
+        </w:rPr>
+        <w:t>Transactions of the Association for Computational Linguistics</w:t>
+      </w:r>
+      <w:r>
+        <w:rPr>
+          <w:lang w:eastAsia="en-US"/>
+        </w:rPr>
+        <w:t xml:space="preserve">, </w:t>
+      </w:r>
+      <w:r>
+        <w:rPr>
+          <w:i/>
+          <w:iCs/>
+          <w:lang w:eastAsia="en-US"/>
+        </w:rPr>
+        <w:t>9</w:t>
+      </w:r>
+      <w:r>
+        <w:rPr>
+          <w:lang w:eastAsia="en-US"/>
+        </w:rPr>
+        <w:t>, 1460–1474. https://doi.org/10.1162/tacl_a_00437</w:t>
+      </w:r>
+    </w:p>
+    <w:p>
+      <w:pPr>
+        <w:pStyle w:val="Bibliography"/>
+        <w:rPr>
+          <w:lang w:eastAsia="en-US"/>
+        </w:rPr>
+      </w:pPr>
+      <w:r>
+        <w:rPr>
+          <w:lang w:eastAsia="en-US"/>
+        </w:rPr>
         <w:t xml:space="preserve">Goodhue, D. L., &amp; Thompson, R. L. (1995). Task-technology fit and individual performance. </w:t>
       </w:r>
       <w:r>
@@ -7518,7 +7645,7 @@
         <w:rPr>
           <w:lang w:eastAsia="en-US"/>
         </w:rPr>
-        <w:t xml:space="preserve">Hevner, A., March, S., Park, J., &amp; Ram, S. (2004). Design science in information systems research. </w:t>
+        <w:t xml:space="preserve">Hevner, A. R., March, S. T., Park, J., &amp; Ram, S. (2004). Design science in information systems research. </w:t>
       </w:r>
       <w:r>
         <w:rPr>
@@ -7560,7 +7687,7 @@
         <w:rPr>
           <w:lang w:eastAsia="en-US"/>
         </w:rPr>
-        <w:t xml:space="preserve">Ji, Z., Lee, N., Frieske, R., Yu, T., Su, D., Xu, Y., Ishii, E., Bang, Y., Chen, D., Dai, W., Chan, H. S., Madotto, A., &amp; Fung, P. (2024). Survey of hallucination in natural language generation. </w:t>
+        <w:t xml:space="preserve">Ji, Z., Lee, N., Frieske, R., Yu, T., Su, D., Xu, Y., Ishii, E., Bang, Y. J., Madotto, A., &amp; Fung, P. (2023). Survey of hallucination in natural language generation. </w:t>
       </w:r>
       <w:r>
         <w:rPr>
@@ -7588,7 +7715,7 @@
         <w:rPr>
           <w:lang w:eastAsia="en-US"/>
         </w:rPr>
-        <w:t>(12), 1–38. https://doi.org/10.1145/3571730</w:t>
+        <w:t>(12), Article 248. https://doi.org/10.1145/3571730</w:t>
       </w:r>
     </w:p>
     <w:p>
@@ -7630,6 +7757,63 @@
         <w:rPr>
           <w:lang w:eastAsia="en-US"/>
         </w:rPr>
+        <w:lastRenderedPageBreak/>
+        <w:t xml:space="preserve">Kuzu, T. E. (2026). AI-supported translanguaging processes in primary school: Empirical insights into ChatGPT’s role in multilingual interactions. </w:t>
+      </w:r>
+      <w:r>
+        <w:rPr>
+          <w:i/>
+          <w:iCs/>
+          <w:lang w:eastAsia="en-US"/>
+        </w:rPr>
+        <w:t>Technology, Knowledge and Learning</w:t>
+      </w:r>
+      <w:r>
+        <w:rPr>
+          <w:lang w:eastAsia="en-US"/>
+        </w:rPr>
+        <w:t>. Advance online publication. https://doi.org/10.1007/s10758-026-09974-7</w:t>
+      </w:r>
+    </w:p>
+    <w:p>
+      <w:pPr>
+        <w:pStyle w:val="Bibliography"/>
+        <w:rPr>
+          <w:lang w:eastAsia="en-US"/>
+        </w:rPr>
+      </w:pPr>
+      <w:r>
+        <w:rPr>
+          <w:lang w:eastAsia="en-US"/>
+        </w:rPr>
+        <w:t xml:space="preserve">MQM Council. (n.d.). </w:t>
+      </w:r>
+      <w:r>
+        <w:rPr>
+          <w:i/>
+          <w:iCs/>
+          <w:lang w:eastAsia="en-US"/>
+        </w:rPr>
+        <w:t>The MQM core typology</w:t>
+      </w:r>
+      <w:r>
+        <w:rPr>
+          <w:lang w:eastAsia="en-US"/>
+        </w:rPr>
+        <w:t>. Retrieved October 6, 2026, from https://www.themqm.org/mqm-pillars/the-mqm-core-typology/</w:t>
+      </w:r>
+    </w:p>
+    <w:p>
+      <w:pPr>
+        <w:pStyle w:val="Bibliography"/>
+        <w:rPr>
+          <w:lang w:eastAsia="en-US"/>
+        </w:rPr>
+      </w:pPr>
+      <w:r>
+        <w:rPr>
+          <w:lang w:eastAsia="en-US"/>
+        </w:rPr>
         <w:t xml:space="preserve">Sweller, J. (1988). Cognitive load during problem solving: Effects on learning. </w:t>
       </w:r>
       <w:r>
@@ -7672,7 +7856,6 @@
         <w:rPr>
           <w:lang w:eastAsia="en-US"/>
         </w:rPr>
-        <w:lastRenderedPageBreak/>
         <w:t xml:space="preserve">Tran, H. T. H., Martinc, M., Caporusso, J., Delaunay, J., Doucet, A., &amp; Pollak, S. (2026). Recent advances in automatic term extraction: A comprehensive survey. </w:t>
       </w:r>
       <w:r>
@@ -7701,7 +7884,7 @@
         <w:rPr>
           <w:lang w:eastAsia="en-US"/>
         </w:rPr>
-        <w:t>(9), 226:1-226:35. https://doi.org/10.1145/3787584</w:t>
+        <w:t>(9), Article 226. https://doi.org/10.1145/3787584</w:t>
       </w:r>
     </w:p>
     <w:p>
@@ -10682,7 +10865,21 @@
                 <w:sz w:val="20"/>
                 <w:szCs w:val="20"/>
               </w:rPr>
-              <w:t>The application enforces its stored-round bound</w:t>
+              <w:t xml:space="preserve">The application enforces its </w:t>
+            </w:r>
+            <w:r>
+              <w:rPr>
+                <w:sz w:val="20"/>
+                <w:szCs w:val="20"/>
+              </w:rPr>
+              <w:t>stored round</w:t>
+            </w:r>
+            <w:r>
+              <w:rPr>
+                <w:sz w:val="20"/>
+                <w:szCs w:val="20"/>
+              </w:rPr>
+              <w:t xml:space="preserve"> bound</w:t>
             </w:r>
           </w:p>
         </w:tc>
@@ -12471,7 +12668,52 @@
         <w:jc w:val="both"/>
       </w:pPr>
       <w:r>
-        <w:t>Thirty-two saved outputs were selected using known content concerns. Every delivered main concept, all three language-help cases and selected adaptations were included. All 104 matching passages were examined using categories informed by Freitag et al. (2021) and MQM Council (n.d.). Accessibility and problems shared by both languages were added as local categories. Selection was not random, and earlier findings were known. English was used for comparison, not assumed to be scientifically correct. Scientific references and stored text were checked separately. No approved Burmese glossary or independent qualified verification was available.</w:t>
+        <w:t xml:space="preserve">Thirty-two saved outputs were selected using known content concerns. Every delivered main concept, all three language-help cases and selected adaptations were included. All 104 matching passages were examined using categories informed by Freitag et al. </w:t>
+      </w:r>
+      <w:r>
+        <w:fldChar w:fldCharType="begin"/>
+      </w:r>
+      <w:r>
+        <w:instrText xml:space="preserve"> ADDIN ZOTERO_ITEM CSL_CITATION {"citationID":"a19clbfi998","properties":{"unsorted":false,"formattedCitation":"(2021)","plainCitation":"(2021)","noteIndex":0},"citationItems":[{"id":158,"uris":["http://zotero.org/users/local/W3Vhviin/items/JQ4MDKJ9"],"itemData":{"id":158,"type":"article-journal","abstract":"Human evaluation of modern high-quality machine translation systems is a difficult problem, and there is increasing evidence that inadequate evaluation procedures can lead to erroneous conclusions. While there has been considerable research on human evaluation, the field still lacks a commonly accepted standard procedure. As a step toward this goal, we propose an evaluation methodology grounded in explicit error analysis, based on the Multidimensional Quality Metrics (MQM) framework. We carry out the largest MQM research study to date, scoring the outputs of top systems from the WMT 2020 shared task in two language pairs using annotations provided by professional translators with access to full document context. We analyze the resulting data extensively, finding among other results a substantially different ranking of evaluated systems from the one established by the WMT crowd workers, exhibiting a clear preference for human over machine output. Surprisingly, we also find that automatic metrics based on pre-trained embeddings can outperform human crowd workers. We make our corpus publicly available for further research.","container-title":"Transactions of the Association for Computational Linguistics","DOI":"10.1162/tacl_a_00437","page":"1460–1474","publisher":"MIT Press","publisher-place":"Cambridge, MA","source":"ACLWeb","title":"Experts, errors, and context: A large-scale study of human evaluation for machine translation","title-short":"Experts, Errors, and Context","volume":"9","author":[{"family":"Freitag","given":"Markus"},{"family":"Foster","given":"George"},{"family":"Grangier","given":"David"},{"family":"Ratnakar","given":"Viresh"},{"family":"Tan","given":"Qijun"},{"family":"Macherey","given":"Wolfgang"}],"editor":[{"family":"Roark","given":"Brian"},{"family":"Nenkova","given":"Ani"}],"issued":{"date-parts":[["2021"]]}},"suppress-author":true}],"schema":"https://github.com/citation-style-language/schema/raw/master/csl-citation.json"} </w:instrText>
+      </w:r>
+      <w:r>
+        <w:fldChar w:fldCharType="separate"/>
+      </w:r>
+      <w:r>
+        <w:rPr>
+          <w:lang w:eastAsia="en-US"/>
+        </w:rPr>
+        <w:t>(2021)</w:t>
+      </w:r>
+      <w:r>
+        <w:fldChar w:fldCharType="end"/>
+      </w:r>
+      <w:r>
+        <w:t xml:space="preserve"> and MQM Council</w:t>
+      </w:r>
+      <w:r>
+        <w:t xml:space="preserve"> </w:t>
+      </w:r>
+      <w:r>
+        <w:fldChar w:fldCharType="begin"/>
+      </w:r>
+      <w:r>
+        <w:instrText xml:space="preserve"> ADDIN ZOTERO_ITEM CSL_CITATION {"citationID":"a17bs8rgou9","properties":{"unsorted":false,"formattedCitation":"(n.d.)","plainCitation":"(n.d.)","noteIndex":0},"citationItems":[{"id":162,"uris":["http://zotero.org/users/local/W3Vhviin/items/DWUUQ7KS"],"itemData":{"id":162,"type":"webpage","abstract":"The MQM-Core error typology in interactive tree view: seven high-level error dimensions with their subtypes, definitions, and examples. Click any category to unfold it.","language":"en-US","title":"The MQM core typology","URL":"https://www.themqm.org/mqm-pillars/the-mqm-core-typology/","author":[{"literal":"MQM Council"}],"accessed":{"date-parts":[["2026",10,6]]}},"suppress-author":true}],"schema":"https://github.com/citation-style-language/schema/raw/master/csl-citation.json"} </w:instrText>
+      </w:r>
+      <w:r>
+        <w:fldChar w:fldCharType="separate"/>
+      </w:r>
+      <w:r>
+        <w:rPr>
+          <w:lang w:eastAsia="en-US"/>
+        </w:rPr>
+        <w:t>(n.d.)</w:t>
+      </w:r>
+      <w:r>
+        <w:fldChar w:fldCharType="end"/>
+      </w:r>
+      <w:r>
+        <w:t>. Accessibility and problems shared by both languages were added as local categories. Selection was not random, and earlier findings were known. English was used for comparison, not assumed to be scientifically correct. No approved Burmese glossary or independent qualified verification was available.</w:t>
       </w:r>
     </w:p>
     <w:p>
@@ -14540,11 +14782,23 @@
         <w:t>Note.</w:t>
       </w:r>
       <w:r>
-        <w:t xml:space="preserve"> Scientific checks used Urone and Hinrichs (2022, Sections 6.5 and 20.1) for mass, weight and current, Flowers et al. (2019, Sections 2.6 and 14.2) for ions and pH, and Clark et al. (2018, Section 8.1) for photosynthesis. Scientific meaning, not certified Burmese wording, is supported </w:t>
+        <w:t xml:space="preserve"> </w:t>
+      </w:r>
+      <w:r>
+        <w:t xml:space="preserve">Scientific meaning and English–Burmese consistency </w:t>
+      </w:r>
+      <w:r>
+        <w:t>were</w:t>
+      </w:r>
+      <w:r>
+        <w:t xml:space="preserve"> assessed using postgraduate-level STEM knowledge and bilingual proficiency. These judgements were not independently verified by a second qualified assessor</w:t>
+      </w:r>
+      <w:r>
+        <w:t xml:space="preserve">. Excerpts are copied exactly from saved outputs. Suggested </w:t>
       </w:r>
       <w:r>
         <w:lastRenderedPageBreak/>
-        <w:t>by these sources. Excerpts are copied exactly from saved outputs. Suggested revisions were not applied to stored text. Both gravity issues belong to one failed output. The original pH rating remains partial despite a major passage-level issue. Totals remain 18 pass, 71 partial and two fail. Reused evidence, assessor limitations and deliberate selection prevent claims about overall translation accuracy or learner benefit.</w:t>
+        <w:t>revisions were not applied to stored text. Both gravity issues belong to one failed output. The original pH rating remains partial despite a major passage-level issue. Totals remain 18 pass, 71 partial and two fail. Reused evidence, assessor limitations and deliberate selection prevent claims about overall translation accuracy or learner benefit.</w:t>
       </w:r>
     </w:p>
     <w:p>
@@ -17438,7 +17692,13 @@
         <w:t>Note.</w:t>
       </w:r>
       <w:r>
-        <w:t xml:space="preserve"> Severity 1 means a cosmetic issue, 2 a difficulty with a workaround and 3 a blocked task or seriously misleading behaviour. Error presentation after an infrastructure failure when saving preferences was not assessed.</w:t>
+        <w:t xml:space="preserve"> Severity 1 means a cosmetic issue, 2 a difficulty with a workaround and 3 a blocked task or seriously misleading </w:t>
+      </w:r>
+      <w:r>
+        <w:t>behavior</w:t>
+      </w:r>
+      <w:r>
+        <w:t>. Error presentation after an infrastructure failure when saving preferences was not assessed.</w:t>
       </w:r>
     </w:p>
     <w:p>
@@ -18582,7 +18842,21 @@
                 <w:sz w:val="20"/>
                 <w:szCs w:val="20"/>
               </w:rPr>
-              <w:t>Requirement coverage and support beyond translation were recognised. Self-report, adaptation decisions and overlapping explanation/scaffolding roles were challenged</w:t>
+              <w:t xml:space="preserve">Requirement coverage and support beyond translation were </w:t>
+            </w:r>
+            <w:r>
+              <w:rPr>
+                <w:sz w:val="20"/>
+                <w:szCs w:val="20"/>
+              </w:rPr>
+              <w:t>recognized</w:t>
+            </w:r>
+            <w:r>
+              <w:rPr>
+                <w:sz w:val="20"/>
+                <w:szCs w:val="20"/>
+              </w:rPr>
+              <w:t>. Self-report, adaptation decisions and overlapping explanation/scaffolding roles were challenged</w:t>
             </w:r>
           </w:p>
         </w:tc>
@@ -18747,7 +19021,308 @@
                 <w:sz w:val="20"/>
                 <w:szCs w:val="20"/>
               </w:rPr>
-              <w:t>Tran et al. (2023), Goodhue and Thompson (1995), Sweller (1988), Ji et al. (2024), Kleidermacher and Zou (2026), van de Pol et al. (2010), and Dunlosky and Rawson (2012) support design reasons and objections, not learner outcomes</w:t>
+              <w:t xml:space="preserve">Tran et al. </w:t>
+            </w:r>
+            <w:r>
+              <w:rPr>
+                <w:sz w:val="20"/>
+                <w:szCs w:val="20"/>
+              </w:rPr>
+              <w:fldChar w:fldCharType="begin"/>
+            </w:r>
+            <w:r>
+              <w:rPr>
+                <w:sz w:val="20"/>
+                <w:szCs w:val="20"/>
+              </w:rPr>
+              <w:instrText xml:space="preserve"> ADDIN ZOTERO_ITEM CSL_CITATION {"citationID":"a2j3uq7fr93","properties":{"unsorted":false,"formattedCitation":"(2026)","plainCitation":"(2026)","noteIndex":0},"citationItems":[{"id":86,"uris":["http://zotero.org/users/local/W3Vhviin/items/QTKBFM9B"],"itemData":{"id":86,"type":"article-journal","abstract":"Automatic terminology or term extraction (ATE) is a Natural Language Processing (NLP) task intended to automatically identify specialized terms present in domain-specific corpora. As units of knowledge in a specific field of expertise, extracted terms are not only beneficial for several terminographical tasks, but also support and improve several complex downstream tasks, e.g., information retrieval, machine translation, topic detection, and sentiment analysis. ATE systems and datasets annotated for the task at hand have been studied and developed for decades, but more recent approaches have increasingly involved novel neural systems. Despite a large amount of new research on ATE tasks, systematic survey studies covering novel neural approaches are lacking, especially when it comes to the usage of large-scale language models (LLMs). We present a comprehensive survey of neural approaches to ATE, focusing on transformer-based neural models and the recent generative approaches based on LLMs. The study also compares these systems and previous ML-based approaches, which employed feature engineering and non-neural supervised learning algorithms.","container-title":"ACM Computing Surveys","DOI":"10.1145/3787584","ISSN":"0360-0300","issue":"9","note":"number: 226","source":"ACM Digital Library","title":"Recent advances in automatic term extraction: A comprehensive survey","title-short":"Recent Advances in Automatic Term Extraction","URL":"https://dl.acm.org/doi/10.1145/3787584","volume":"58","author":[{"family":"Tran","given":"Hanh Thi Hong"},{"family":"Martinc","given":"Matej"},{"family":"Caporusso","given":"Jaya"},{"family":"Delaunay","given":"Julien"},{"family":"Doucet","given":"Antoine"},{"family":"Pollak","given":"Senja"}],"accessed":{"date-parts":[["2026",8,7]]},"issued":{"date-parts":[["2026",2,25]]}},"suppress-author":true}],"schema":"https://github.com/citation-style-language/schema/raw/master/csl-citation.json"} </w:instrText>
+            </w:r>
+            <w:r>
+              <w:rPr>
+                <w:sz w:val="20"/>
+                <w:szCs w:val="20"/>
+              </w:rPr>
+              <w:fldChar w:fldCharType="separate"/>
+            </w:r>
+            <w:r>
+              <w:rPr>
+                <w:sz w:val="20"/>
+                <w:lang w:eastAsia="en-US"/>
+              </w:rPr>
+              <w:t>(2026)</w:t>
+            </w:r>
+            <w:r>
+              <w:rPr>
+                <w:sz w:val="20"/>
+                <w:szCs w:val="20"/>
+              </w:rPr>
+              <w:fldChar w:fldCharType="end"/>
+            </w:r>
+            <w:r>
+              <w:rPr>
+                <w:sz w:val="20"/>
+                <w:szCs w:val="20"/>
+              </w:rPr>
+              <w:t xml:space="preserve">, Goodhue and Thompson </w:t>
+            </w:r>
+            <w:r>
+              <w:rPr>
+                <w:sz w:val="20"/>
+                <w:szCs w:val="20"/>
+              </w:rPr>
+              <w:fldChar w:fldCharType="begin"/>
+            </w:r>
+            <w:r>
+              <w:rPr>
+                <w:sz w:val="20"/>
+                <w:szCs w:val="20"/>
+              </w:rPr>
+              <w:instrText xml:space="preserve"> ADDIN ZOTERO_ITEM CSL_CITATION {"citationID":"a21gbtpgr7e","properties":{"unsorted":false,"formattedCitation":"(1995)","plainCitation":"(1995)","noteIndex":0},"citationItems":[{"id":137,"uris":["http://zotero.org/users/local/W3Vhviin/items/UMPPMIZC"],"itemData":{"id":137,"type":"article-journal","abstract":"A key concern in Information Systems (IS) research has been to better understand the linkage between information systems and individual performance. The research reported in this study has two primary objectives: (1) to propose a comprehensive theoretical model that incorporates valuable insights from two comple mentary streams of research, and (2) to empirically test the core of the model. At the heart of the new model is the assertion that for an information technology to have a positive impact on individual performance, the technology: (1) must be utilized and (2) must be a good fit with the tasks it supports. This new model is moderately supported by an analysis of data from over 600 individuals in two companies. This research highlights the importance of the fit between technologies and users' tasks in achieving individual performance impacts from information technology. It also suggests that task-technology fit, when decomposed into its more detailed components, could be the basis for a strong diagnostic tool to evaluate whether information systems and services in a given organization are meeting user needs.","container-title":"MIS Quarterly","DOI":"10.2307/249689","ISSN":"0276-7783","issue":"2","page":"213-236","publisher":"Management Information Systems Research Center, University of Minnesota","source":"JSTOR","title":"Task-technology fit and individual performance","volume":"19","author":[{"family":"Goodhue","given":"Dale L."},{"family":"Thompson","given":"Ronald L."}],"issued":{"date-parts":[["1995"]]}},"suppress-author":true}],"schema":"https://github.com/citation-style-language/schema/raw/master/csl-citation.json"} </w:instrText>
+            </w:r>
+            <w:r>
+              <w:rPr>
+                <w:sz w:val="20"/>
+                <w:szCs w:val="20"/>
+              </w:rPr>
+              <w:fldChar w:fldCharType="separate"/>
+            </w:r>
+            <w:r>
+              <w:rPr>
+                <w:sz w:val="20"/>
+                <w:lang w:eastAsia="en-US"/>
+              </w:rPr>
+              <w:t>(1995)</w:t>
+            </w:r>
+            <w:r>
+              <w:rPr>
+                <w:sz w:val="20"/>
+                <w:szCs w:val="20"/>
+              </w:rPr>
+              <w:fldChar w:fldCharType="end"/>
+            </w:r>
+            <w:r>
+              <w:rPr>
+                <w:sz w:val="20"/>
+                <w:szCs w:val="20"/>
+              </w:rPr>
+              <w:t xml:space="preserve">, Sweller </w:t>
+            </w:r>
+            <w:r>
+              <w:rPr>
+                <w:sz w:val="20"/>
+                <w:szCs w:val="20"/>
+              </w:rPr>
+              <w:fldChar w:fldCharType="begin"/>
+            </w:r>
+            <w:r>
+              <w:rPr>
+                <w:sz w:val="20"/>
+                <w:szCs w:val="20"/>
+              </w:rPr>
+              <w:instrText xml:space="preserve"> ADDIN ZOTERO_ITEM CSL_CITATION {"citationID":"ac9r644k5l","properties":{"unsorted":false,"formattedCitation":"(1988)","plainCitation":"(1988)","noteIndex":0},"citationItems":[{"id":149,"uris":["http://zotero.org/users/local/W3Vhviin/items/KIKPVXTV"],"itemData":{"id":149,"type":"article-journal","abstract":"Considerable evidence indicates that domain specific knowledge in the form of schemas is the primary factor distinguishing experts from novices in problem-solving skill. Evidence that conventional problem-solving activity is not effective in schema acquisition is also accumulating. It is suggested that a major reason for the ineffectiveness of problem solving as a learning device, is that the cognitive processes required by the two activities overlap insufficiently, and that conventional problem solving in the form of means-ends analysis requires a relatively large amount of cognitive processing capacity which is consequently unavailable for schema acquisition. A computational model and experimental evidence provide support for this contention. Theoretical and practical implications are discussed.","container-title":"Cognitive Science","DOI":"10.1207/s15516709cog1202_4","ISSN":"1551-6709","issue":"2","language":"en","license":"© 1988 Cognitive Science Society, Inc.","page":"257-285","source":"Wiley Online Library","title":"Cognitive load during problem solving: Effects on learning","title-short":"Cognitive Load During Problem Solving","volume":"12","author":[{"family":"Sweller","given":"John"}],"issued":{"date-parts":[["1988"]]}},"suppress-author":true}],"schema":"https://github.com/citation-style-language/schema/raw/master/csl-citation.json"} </w:instrText>
+            </w:r>
+            <w:r>
+              <w:rPr>
+                <w:sz w:val="20"/>
+                <w:szCs w:val="20"/>
+              </w:rPr>
+              <w:fldChar w:fldCharType="separate"/>
+            </w:r>
+            <w:r>
+              <w:rPr>
+                <w:sz w:val="20"/>
+                <w:lang w:eastAsia="en-US"/>
+              </w:rPr>
+              <w:t>(1988)</w:t>
+            </w:r>
+            <w:r>
+              <w:rPr>
+                <w:sz w:val="20"/>
+                <w:szCs w:val="20"/>
+              </w:rPr>
+              <w:fldChar w:fldCharType="end"/>
+            </w:r>
+            <w:r>
+              <w:rPr>
+                <w:sz w:val="20"/>
+                <w:szCs w:val="20"/>
+              </w:rPr>
+              <w:t>, Ji et al.</w:t>
+            </w:r>
+            <w:r>
+              <w:rPr>
+                <w:sz w:val="20"/>
+                <w:szCs w:val="20"/>
+              </w:rPr>
+              <w:t xml:space="preserve"> </w:t>
+            </w:r>
+            <w:r>
+              <w:rPr>
+                <w:sz w:val="20"/>
+                <w:szCs w:val="20"/>
+              </w:rPr>
+              <w:fldChar w:fldCharType="begin"/>
+            </w:r>
+            <w:r>
+              <w:rPr>
+                <w:sz w:val="20"/>
+                <w:szCs w:val="20"/>
+              </w:rPr>
+              <w:instrText xml:space="preserve"> ADDIN ZOTERO_ITEM CSL_CITATION {"citationID":"a2m2p2e7cf6","properties":{"unsorted":false,"formattedCitation":"(2023)","plainCitation":"(2023)","noteIndex":0},"citationItems":[{"id":164,"uris":["http://zotero.org/users/local/W3Vhviin/items/G2SVVUX3"],"itemData":{"id":164,"type":"article-journal","abstract":"Natural Language Generation (NLG) has improved exponentially in recent years thanks to the development of sequence-to-sequence deep learning technologies such as Transformer-based language models. This advancement has led to more fluent and coherent NLG, leading to improved development in downstream tasks such as abstractive summarization, dialogue generation, and data-to-text generation. However, it is also apparent that deep learning based generation is prone to hallucinate unintended text, which degrades the system performance and fails to meet user expectations in many real-world scenarios. To address this issue, many studies have been presented in measuring and mitigating hallucinated texts, but these have never been reviewed in a comprehensive manner before.In this survey, we thus provide a broad overview of the research progress and challenges in the hallucination problem in NLG. The survey is organized into two parts: (1) a general overview of metrics, mitigation methods, and future directions, and (2) an overview of task-specific research progress on hallucinations in the following downstream tasks, namely abstractive summarization, dialogue generation, generative question answering, data-to-text generation, and machine translation. This survey serves to facilitate collaborative efforts among researchers in tackling the challenge of hallucinated texts in NLG.","container-title":"ACM Computing Surveys","DOI":"10.1145/3571730","ISSN":"0360-0300","issue":"12","journalAbbreviation":"ACM Comput. Surv.","note":"number: 248","page":"248:1–248:38","source":"ACM Digital Library","title":"Survey of hallucination in natural language generation","volume":"55","author":[{"family":"Ji","given":"Ziwei"},{"family":"Lee","given":"Nayeon"},{"family":"Frieske","given":"Rita"},{"family":"Yu","given":"Tiezheng"},{"family":"Su","given":"Dan"},{"family":"Xu","given":"Yan"},{"family":"Ishii","given":"Etsuko"},{"family":"Bang","given":"Ye Jin"},{"family":"Madotto","given":"Andrea"},{"family":"Fung","given":"Pascale"}],"issued":{"date-parts":[["2023",3,3]]}},"suppress-author":true}],"schema":"https://github.com/citation-style-language/schema/raw/master/csl-citation.json"} </w:instrText>
+            </w:r>
+            <w:r>
+              <w:rPr>
+                <w:sz w:val="20"/>
+                <w:szCs w:val="20"/>
+              </w:rPr>
+              <w:fldChar w:fldCharType="separate"/>
+            </w:r>
+            <w:r>
+              <w:rPr>
+                <w:sz w:val="20"/>
+                <w:lang w:eastAsia="en-US"/>
+              </w:rPr>
+              <w:t>(2023)</w:t>
+            </w:r>
+            <w:r>
+              <w:rPr>
+                <w:sz w:val="20"/>
+                <w:szCs w:val="20"/>
+              </w:rPr>
+              <w:fldChar w:fldCharType="end"/>
+            </w:r>
+            <w:r>
+              <w:rPr>
+                <w:sz w:val="20"/>
+                <w:szCs w:val="20"/>
+              </w:rPr>
+              <w:t xml:space="preserve">, Kleidermacher and Zou </w:t>
+            </w:r>
+            <w:r>
+              <w:rPr>
+                <w:sz w:val="20"/>
+                <w:szCs w:val="20"/>
+              </w:rPr>
+              <w:fldChar w:fldCharType="begin"/>
+            </w:r>
+            <w:r>
+              <w:rPr>
+                <w:sz w:val="20"/>
+                <w:szCs w:val="20"/>
+              </w:rPr>
+              <w:instrText xml:space="preserve"> ADDIN ZOTERO_ITEM CSL_CITATION {"citationID":"a29lb55vrr7","properties":{"unsorted":false,"formattedCitation":"(2026)","plainCitation":"(2026)","noteIndex":0},"citationItems":[{"id":104,"uris":["http://zotero.org/users/local/W3Vhviin/items/G8TK2URJ"],"itemData":{"id":104,"type":"paper-conference","abstract":"Scientific research is inherently global. However, the vast majority of academic journals are published exclusively in English, creating barriers for non-native-English-speaking researchers. In this study, we leverage large language models (LLMs) to translate published scientific articles while preserving their native JATS XML formatting, thereby developing a practical, automated approach for implementation by academic journals. Using our approach, we translate articles across multiple scientific disciplines into 28 languages. To evaluate translation accuracy, we introduce a novel question-and-answer (QA) benchmarking method and show an average performance of 95.9%, indicating that the key scientific details are accurately conveyed. In a user study, we translate the scientific papers of 15 researchers into their native languages. Interestingly, a third of the authors found many technical terms “overtranslated,” expressing a preference to keep terminology more familiar in English untranslated. Finally, we demonstrate how in-context learning techniques can be used to align translations with domain-specific preferences such as mitigating overtranslation, highlighting the adaptability and utility of LLM-driven scientific translation.","container-title":"Findings of the Association for Computational Linguistics: EACL 2026","DOI":"10.18653/v1/2026.findings-eacl.204","event-title":"Findings 2026","ISBN":"979-8-89176-386-9","page":"3932–3947","publisher":"Association for Computational Linguistics","publisher-place":"Rabat, Morocco","source":"ACLWeb","title":"Science across languages: Assessing LLM multilingual translation of scientific papers","title-short":"Science Across Languages","URL":"https://aclanthology.org/2026.findings-eacl.204/","author":[{"family":"Kleidermacher","given":"Hannah Calzi"},{"family":"Zou","given":"James"}],"editor":[{"family":"Demberg","given":"Vera"},{"family":"Inui","given":"Kentaro"},{"family":"Marquez","given":"Lluís"}],"accessed":{"date-parts":[["2026",8,7]]},"issued":{"date-parts":[["2026",3]]}},"suppress-author":true}],"schema":"https://github.com/citation-style-language/schema/raw/master/csl-citation.json"} </w:instrText>
+            </w:r>
+            <w:r>
+              <w:rPr>
+                <w:sz w:val="20"/>
+                <w:szCs w:val="20"/>
+              </w:rPr>
+              <w:fldChar w:fldCharType="separate"/>
+            </w:r>
+            <w:r>
+              <w:rPr>
+                <w:sz w:val="20"/>
+                <w:lang w:eastAsia="en-US"/>
+              </w:rPr>
+              <w:t>(2026)</w:t>
+            </w:r>
+            <w:r>
+              <w:rPr>
+                <w:sz w:val="20"/>
+                <w:szCs w:val="20"/>
+              </w:rPr>
+              <w:fldChar w:fldCharType="end"/>
+            </w:r>
+            <w:r>
+              <w:rPr>
+                <w:sz w:val="20"/>
+                <w:szCs w:val="20"/>
+              </w:rPr>
+              <w:t xml:space="preserve">, van de Pol et al. </w:t>
+            </w:r>
+            <w:r>
+              <w:rPr>
+                <w:sz w:val="20"/>
+                <w:szCs w:val="20"/>
+              </w:rPr>
+              <w:fldChar w:fldCharType="begin"/>
+            </w:r>
+            <w:r>
+              <w:rPr>
+                <w:sz w:val="20"/>
+                <w:szCs w:val="20"/>
+              </w:rPr>
+              <w:instrText xml:space="preserve"> ADDIN ZOTERO_ITEM CSL_CITATION {"citationID":"a1hhmvh24lt","properties":{"unsorted":false,"formattedCitation":"(2010)","plainCitation":"(2010)","noteIndex":0},"citationItems":[{"id":145,"uris":["http://zotero.org/users/local/W3Vhviin/items/ARFPCASM"],"itemData":{"id":145,"type":"article-journal","abstract":"Although scaffolding is an important and frequently studied concept, much discussion exists with regard to its conceptualizations, appearances, and effectiveness. Departing from the last decade’s scaffolding literature, this review scrutinizes these three areas of scaffolding. First, contingency, fading, and transfer of responsibility are discerned in this review as the three key characteristics of scaffolding. Second, an overview is presented of the numerous descriptive studies that provided narratives on the appearances of scaffolding and classifications of scaffolding strategies. These strategies are synthesized into a framework for analysis, distinguishing between scaffolding means and intentions. Third, the small number of effectiveness studies available is discussed and the results suggest that scaffolding is effective. However, more research is needed. The main challenge in scaffolding research appears to be its measurement. Based on the encountered and described measurement problems, suggestions for future research are made.","container-title":"Educational Psychology Review","DOI":"10.1007/s10648-010-9127-6","ISSN":"1573-336X","issue":"3","journalAbbreviation":"Educ Psychol Rev","language":"en","page":"271-296","source":"Springer Link","title":"Scaffolding in teacher–student interaction: A decade of research","title-short":"Scaffolding in Teacher–Student Interaction","volume":"22","author":[{"family":"Pol","given":"Janneke","non-dropping-particle":"van de"},{"family":"Volman","given":"Monique"},{"family":"Beishuizen","given":"Jos"}],"issued":{"date-parts":[["2010",9,1]]}},"suppress-author":true}],"schema":"https://github.com/citation-style-language/schema/raw/master/csl-citation.json"} </w:instrText>
+            </w:r>
+            <w:r>
+              <w:rPr>
+                <w:sz w:val="20"/>
+                <w:szCs w:val="20"/>
+              </w:rPr>
+              <w:fldChar w:fldCharType="separate"/>
+            </w:r>
+            <w:r>
+              <w:rPr>
+                <w:sz w:val="20"/>
+                <w:lang w:eastAsia="en-US"/>
+              </w:rPr>
+              <w:t>(2010)</w:t>
+            </w:r>
+            <w:r>
+              <w:rPr>
+                <w:sz w:val="20"/>
+                <w:szCs w:val="20"/>
+              </w:rPr>
+              <w:fldChar w:fldCharType="end"/>
+            </w:r>
+            <w:r>
+              <w:rPr>
+                <w:sz w:val="20"/>
+                <w:szCs w:val="20"/>
+              </w:rPr>
+              <w:t xml:space="preserve">, and Dunlosky and Rawson </w:t>
+            </w:r>
+            <w:r>
+              <w:rPr>
+                <w:sz w:val="20"/>
+                <w:szCs w:val="20"/>
+              </w:rPr>
+              <w:fldChar w:fldCharType="begin"/>
+            </w:r>
+            <w:r>
+              <w:rPr>
+                <w:sz w:val="20"/>
+                <w:szCs w:val="20"/>
+              </w:rPr>
+              <w:instrText xml:space="preserve"> ADDIN ZOTERO_ITEM CSL_CITATION {"citationID":"a2ecs20mh03","properties":{"unsorted":false,"formattedCitation":"(2012)","plainCitation":"(2012)","noteIndex":0},"citationItems":[{"id":155,"uris":["http://zotero.org/users/local/W3Vhviin/items/6IEGB76B"],"itemData":{"id":155,"type":"article-journal","abstract":"The function of accurately monitoring one’s own learning is to support effective control of study that enhances learning. Although this link between monitoring accuracy and learning is intuitively plausible and is assumed by general theories of self-regulated learning, it has not received a great deal of empirical scrutiny and no study to date has examined the link between monitoring accuracy and longer-term retention. Across two studies, college students paced their study of key-term definitions (e.g., “Proactive interference: Information already stored in memory interferes with the learning of new information”). After all definitions were studied, participants completed practice cued recall tests (e.g., “What is proactive interference?”) in which they attempted to type the correct definition for each term. After each test trial, participants judged how much of their response was correct. These study-test-judgment trials continued until a definition was judged as correct three times. A final cued recall test occurred two days later. In Study 1, judgment accuracy was manipulated experimentally, and in Study 2, individual differences in accuracy were examined. In both studies, greater accuracy was associated with higher levels of retention, and this link could not be explained by differential feedback, effort during study, or trials to criterion. Results indicate that many students could benefit from interventions aimed at improving their skill at judging their learning.","container-title":"Learning and Instruction","DOI":"10.1016/j.learninstruc.2011.08.003","ISSN":"0959-4752","issue":"4","journalAbbreviation":"Learning and Instruction","page":"271-280","source":"ScienceDirect","title":"Overconfidence produces underachievement: Inaccurate self evaluations undermine students’ learning and retention","title-short":"Overconfidence produces underachievement","volume":"22","author":[{"family":"Dunlosky","given":"John"},{"family":"Rawson","given":"Katherine A."}],"issued":{"date-parts":[["2012",8,1]]}},"suppress-author":true}],"schema":"https://github.com/citation-style-language/schema/raw/master/csl-citation.json"} </w:instrText>
+            </w:r>
+            <w:r>
+              <w:rPr>
+                <w:sz w:val="20"/>
+                <w:szCs w:val="20"/>
+              </w:rPr>
+              <w:fldChar w:fldCharType="separate"/>
+            </w:r>
+            <w:r>
+              <w:rPr>
+                <w:sz w:val="20"/>
+                <w:lang w:eastAsia="en-US"/>
+              </w:rPr>
+              <w:t>(2012)</w:t>
+            </w:r>
+            <w:r>
+              <w:rPr>
+                <w:sz w:val="20"/>
+                <w:szCs w:val="20"/>
+              </w:rPr>
+              <w:fldChar w:fldCharType="end"/>
+            </w:r>
+            <w:r>
+              <w:rPr>
+                <w:sz w:val="20"/>
+                <w:szCs w:val="20"/>
+              </w:rPr>
+              <w:t xml:space="preserve"> support design reasons and objections, not learner outcomes</w:t>
             </w:r>
           </w:p>
         </w:tc>
@@ -19034,7 +19609,100 @@
                 <w:sz w:val="20"/>
                 <w:szCs w:val="20"/>
               </w:rPr>
-              <w:t>Tran et al. (2023) and Goodhue and Thompson (1995). The intended concept may still be misunderstood or left uncorrected</w:t>
+              <w:t xml:space="preserve">Tran et al. </w:t>
+            </w:r>
+            <w:r>
+              <w:rPr>
+                <w:sz w:val="20"/>
+                <w:szCs w:val="20"/>
+              </w:rPr>
+              <w:fldChar w:fldCharType="begin"/>
+            </w:r>
+            <w:r>
+              <w:rPr>
+                <w:sz w:val="20"/>
+                <w:szCs w:val="20"/>
+              </w:rPr>
+              <w:instrText xml:space="preserve"> ADDIN ZOTERO_ITEM CSL_CITATION {"citationID":"a21o81pbeem","properties":{"unsorted":false,"formattedCitation":"(2026)","plainCitation":"(2026)","noteIndex":0},"citationItems":[{"id":86,"uris":["http://zotero.org/users/local/W3Vhviin/items/QTKBFM9B"],"itemData":{"id":86,"type":"article-journal","abstract":"Automatic terminology or term extraction (ATE) is a Natural Language Processing (NLP) task intended to automatically identify specialized terms present in domain-specific corpora. As units of knowledge in a specific field of expertise, extracted terms are not only beneficial for several terminographical tasks, but also support and improve several complex downstream tasks, e.g., information retrieval, machine translation, topic detection, and sentiment analysis. ATE systems and datasets annotated for the task at hand have been studied and developed for decades, but more recent approaches have increasingly involved novel neural systems. Despite a large amount of new research on ATE tasks, systematic survey studies covering novel neural approaches are lacking, especially when it comes to the usage of large-scale language models (LLMs). We present a comprehensive survey of neural approaches to ATE, focusing on transformer-based neural models and the recent generative approaches based on LLMs. The study also compares these systems and previous ML-based approaches, which employed feature engineering and non-neural supervised learning algorithms.","container-title":"ACM Computing Surveys","DOI":"10.1145/3787584","ISSN":"0360-0300","issue":"9","note":"number: 226","source":"ACM Digital Library","title":"Recent advances in automatic term extraction: A comprehensive survey","title-short":"Recent Advances in Automatic Term Extraction","URL":"https://dl.acm.org/doi/10.1145/3787584","volume":"58","author":[{"family":"Tran","given":"Hanh Thi Hong"},{"family":"Martinc","given":"Matej"},{"family":"Caporusso","given":"Jaya"},{"family":"Delaunay","given":"Julien"},{"family":"Doucet","given":"Antoine"},{"family":"Pollak","given":"Senja"}],"accessed":{"date-parts":[["2026",8,7]]},"issued":{"date-parts":[["2026",2,25]]}},"suppress-author":true}],"schema":"https://github.com/citation-style-language/schema/raw/master/csl-citation.json"} </w:instrText>
+            </w:r>
+            <w:r>
+              <w:rPr>
+                <w:sz w:val="20"/>
+                <w:szCs w:val="20"/>
+              </w:rPr>
+              <w:fldChar w:fldCharType="separate"/>
+            </w:r>
+            <w:r>
+              <w:rPr>
+                <w:sz w:val="20"/>
+                <w:lang w:eastAsia="en-US"/>
+              </w:rPr>
+              <w:t>(2026)</w:t>
+            </w:r>
+            <w:r>
+              <w:rPr>
+                <w:sz w:val="20"/>
+                <w:szCs w:val="20"/>
+              </w:rPr>
+              <w:fldChar w:fldCharType="end"/>
+            </w:r>
+            <w:r>
+              <w:rPr>
+                <w:sz w:val="20"/>
+                <w:szCs w:val="20"/>
+              </w:rPr>
+              <w:t xml:space="preserve"> and Goodhue and Thompson </w:t>
+            </w:r>
+            <w:bookmarkStart w:id="0" w:name="_Hlk242195486"/>
+            <w:r>
+              <w:rPr>
+                <w:sz w:val="20"/>
+                <w:szCs w:val="20"/>
+              </w:rPr>
+              <w:fldChar w:fldCharType="begin"/>
+            </w:r>
+            <w:r>
+              <w:rPr>
+                <w:sz w:val="20"/>
+                <w:szCs w:val="20"/>
+              </w:rPr>
+              <w:instrText xml:space="preserve"> ADDIN ZOTERO_ITEM CSL_CITATION {"citationID":"a2a9tgu6hc2","properties":{"unsorted":false,"formattedCitation":"(1995)","plainCitation":"(1995)","noteIndex":0},"citationItems":[{"id":137,"uris":["http://zotero.org/users/local/W3Vhviin/items/UMPPMIZC"],"itemData":{"id":137,"type":"article-journal","abstract":"A key concern in Information Systems (IS) research has been to better understand the linkage between information systems and individual performance. The research reported in this study has two primary objectives: (1) to propose a comprehensive theoretical model that incorporates valuable insights from two comple mentary streams of research, and (2) to empirically test the core of the model. At the heart of the new model is the assertion that for an information technology to have a positive impact on individual performance, the technology: (1) must be utilized and (2) must be a good fit with the tasks it supports. This new model is moderately supported by an analysis of data from over 600 individuals in two companies. This research highlights the importance of the fit between technologies and users' tasks in achieving individual performance impacts from information technology. It also suggests that task-technology fit, when decomposed into its more detailed components, could be the basis for a strong diagnostic tool to evaluate whether information systems and services in a given organization are meeting user needs.","container-title":"MIS Quarterly","DOI":"10.2307/249689","ISSN":"0276-7783","issue":"2","page":"213-236","publisher":"Management Information Systems Research Center, University of Minnesota","source":"JSTOR","title":"Task-technology fit and individual performance","volume":"19","author":[{"family":"Goodhue","given":"Dale L."},{"family":"Thompson","given":"Ronald L."}],"issued":{"date-parts":[["1995"]]}},"suppress-author":true}],"schema":"https://github.com/citation-style-language/schema/raw/master/csl-citation.json"} </w:instrText>
+            </w:r>
+            <w:r>
+              <w:rPr>
+                <w:sz w:val="20"/>
+                <w:szCs w:val="20"/>
+              </w:rPr>
+              <w:fldChar w:fldCharType="separate"/>
+            </w:r>
+            <w:r>
+              <w:rPr>
+                <w:sz w:val="20"/>
+                <w:lang w:eastAsia="en-US"/>
+              </w:rPr>
+              <w:t>(1995)</w:t>
+            </w:r>
+            <w:r>
+              <w:rPr>
+                <w:sz w:val="20"/>
+                <w:szCs w:val="20"/>
+              </w:rPr>
+              <w:fldChar w:fldCharType="end"/>
+            </w:r>
+            <w:r>
+              <w:rPr>
+                <w:sz w:val="20"/>
+                <w:szCs w:val="20"/>
+              </w:rPr>
+              <w:t>.</w:t>
+            </w:r>
+            <w:bookmarkEnd w:id="0"/>
+            <w:r>
+              <w:rPr>
+                <w:sz w:val="20"/>
+                <w:szCs w:val="20"/>
+              </w:rPr>
+              <w:t xml:space="preserve"> The intended concept may still be misunderstood or left uncorrected</w:t>
             </w:r>
           </w:p>
         </w:tc>
@@ -19105,7 +19773,98 @@
                 <w:sz w:val="20"/>
                 <w:szCs w:val="20"/>
               </w:rPr>
-              <w:t>Kleidermacher and Zou (2026) and Goodhue and Thompson (1995). Term retention does not guarantee clear Burmese support</w:t>
+              <w:t xml:space="preserve">Kleidermacher and Zou </w:t>
+            </w:r>
+            <w:r>
+              <w:rPr>
+                <w:sz w:val="20"/>
+                <w:szCs w:val="20"/>
+              </w:rPr>
+              <w:fldChar w:fldCharType="begin"/>
+            </w:r>
+            <w:r>
+              <w:rPr>
+                <w:sz w:val="20"/>
+                <w:szCs w:val="20"/>
+              </w:rPr>
+              <w:instrText xml:space="preserve"> ADDIN ZOTERO_ITEM CSL_CITATION {"citationID":"a2n6vi5j4au","properties":{"unsorted":false,"formattedCitation":"(2026)","plainCitation":"(2026)","noteIndex":0},"citationItems":[{"id":104,"uris":["http://zotero.org/users/local/W3Vhviin/items/G8TK2URJ"],"itemData":{"id":104,"type":"paper-conference","abstract":"Scientific research is inherently global. However, the vast majority of academic journals are published exclusively in English, creating barriers for non-native-English-speaking researchers. In this study, we leverage large language models (LLMs) to translate published scientific articles while preserving their native JATS XML formatting, thereby developing a practical, automated approach for implementation by academic journals. Using our approach, we translate articles across multiple scientific disciplines into 28 languages. To evaluate translation accuracy, we introduce a novel question-and-answer (QA) benchmarking method and show an average performance of 95.9%, indicating that the key scientific details are accurately conveyed. In a user study, we translate the scientific papers of 15 researchers into their native languages. Interestingly, a third of the authors found many technical terms “overtranslated,” expressing a preference to keep terminology more familiar in English untranslated. Finally, we demonstrate how in-context learning techniques can be used to align translations with domain-specific preferences such as mitigating overtranslation, highlighting the adaptability and utility of LLM-driven scientific translation.","container-title":"Findings of the Association for Computational Linguistics: EACL 2026","DOI":"10.18653/v1/2026.findings-eacl.204","event-title":"Findings 2026","ISBN":"979-8-89176-386-9","page":"3932–3947","publisher":"Association for Computational Linguistics","publisher-place":"Rabat, Morocco","source":"ACLWeb","title":"Science across languages: Assessing LLM multilingual translation of scientific papers","title-short":"Science Across Languages","URL":"https://aclanthology.org/2026.findings-eacl.204/","author":[{"family":"Kleidermacher","given":"Hannah Calzi"},{"family":"Zou","given":"James"}],"editor":[{"family":"Demberg","given":"Vera"},{"family":"Inui","given":"Kentaro"},{"family":"Marquez","given":"Lluís"}],"accessed":{"date-parts":[["2026",8,7]]},"issued":{"date-parts":[["2026",3]]}},"suppress-author":true}],"schema":"https://github.com/citation-style-language/schema/raw/master/csl-citation.json"} </w:instrText>
+            </w:r>
+            <w:r>
+              <w:rPr>
+                <w:sz w:val="20"/>
+                <w:szCs w:val="20"/>
+              </w:rPr>
+              <w:fldChar w:fldCharType="separate"/>
+            </w:r>
+            <w:r>
+              <w:rPr>
+                <w:sz w:val="20"/>
+                <w:lang w:eastAsia="en-US"/>
+              </w:rPr>
+              <w:t>(2026)</w:t>
+            </w:r>
+            <w:r>
+              <w:rPr>
+                <w:sz w:val="20"/>
+                <w:szCs w:val="20"/>
+              </w:rPr>
+              <w:fldChar w:fldCharType="end"/>
+            </w:r>
+            <w:r>
+              <w:rPr>
+                <w:sz w:val="20"/>
+                <w:szCs w:val="20"/>
+              </w:rPr>
+              <w:t xml:space="preserve"> and Goodhue and Thompson </w:t>
+            </w:r>
+            <w:r>
+              <w:rPr>
+                <w:sz w:val="20"/>
+                <w:szCs w:val="20"/>
+              </w:rPr>
+              <w:fldChar w:fldCharType="begin"/>
+            </w:r>
+            <w:r>
+              <w:rPr>
+                <w:sz w:val="20"/>
+                <w:szCs w:val="20"/>
+              </w:rPr>
+              <w:instrText xml:space="preserve"> ADDIN ZOTERO_ITEM CSL_CITATION {"citationID":"BoEVqgxf","properties":{"unsorted":false,"formattedCitation":"(1995)","plainCitation":"(1995)","noteIndex":0},"citationItems":[{"id":137,"uris":["http://zotero.org/users/local/W3Vhviin/items/UMPPMIZC"],"itemData":{"id":137,"type":"article-journal","abstract":"A key concern in Information Systems (IS) research has been to better understand the linkage between information systems and individual performance. The research reported in this study has two primary objectives: (1) to propose a comprehensive theoretical model that incorporates valuable insights from two comple mentary streams of research, and (2) to empirically test the core of the model. At the heart of the new model is the assertion that for an information technology to have a positive impact on individual performance, the technology: (1) must be utilized and (2) must be a good fit with the tasks it supports. This new model is moderately supported by an analysis of data from over 600 individuals in two companies. This research highlights the importance of the fit between technologies and users' tasks in achieving individual performance impacts from information technology. It also suggests that task-technology fit, when decomposed into its more detailed components, could be the basis for a strong diagnostic tool to evaluate whether information systems and services in a given organization are meeting user needs.","container-title":"MIS Quarterly","DOI":"10.2307/249689","ISSN":"0276-7783","issue":"2","page":"213-236","publisher":"Management Information Systems Research Center, University of Minnesota","source":"JSTOR","title":"Task-technology fit and individual performance","volume":"19","author":[{"family":"Goodhue","given":"Dale L."},{"family":"Thompson","given":"Ronald L."}],"issued":{"date-parts":[["1995"]]}},"suppress-author":true}],"schema":"https://github.com/citation-style-language/schema/raw/master/csl-citation.json"} </w:instrText>
+            </w:r>
+            <w:r>
+              <w:rPr>
+                <w:sz w:val="20"/>
+                <w:szCs w:val="20"/>
+              </w:rPr>
+              <w:fldChar w:fldCharType="separate"/>
+            </w:r>
+            <w:r>
+              <w:rPr>
+                <w:sz w:val="20"/>
+                <w:lang w:eastAsia="en-US"/>
+              </w:rPr>
+              <w:t>(1995)</w:t>
+            </w:r>
+            <w:r>
+              <w:rPr>
+                <w:sz w:val="20"/>
+                <w:szCs w:val="20"/>
+              </w:rPr>
+              <w:fldChar w:fldCharType="end"/>
+            </w:r>
+            <w:r>
+              <w:rPr>
+                <w:sz w:val="20"/>
+                <w:szCs w:val="20"/>
+              </w:rPr>
+              <w:t xml:space="preserve">. </w:t>
+            </w:r>
+            <w:r>
+              <w:rPr>
+                <w:sz w:val="20"/>
+                <w:szCs w:val="20"/>
+              </w:rPr>
+              <w:t>Term retention does not guarantee clear Burmese support</w:t>
             </w:r>
           </w:p>
         </w:tc>
@@ -19176,7 +19935,91 @@
                 <w:sz w:val="20"/>
                 <w:szCs w:val="20"/>
               </w:rPr>
-              <w:t>Athukorala and De Silva (2025) and van de Pol et al. (2010). Structured content can remain inaccurate or repetitive</w:t>
+              <w:t xml:space="preserve">Athukorala and De Silva </w:t>
+            </w:r>
+            <w:r>
+              <w:rPr>
+                <w:sz w:val="20"/>
+                <w:szCs w:val="20"/>
+              </w:rPr>
+              <w:fldChar w:fldCharType="begin"/>
+            </w:r>
+            <w:r>
+              <w:rPr>
+                <w:sz w:val="20"/>
+                <w:szCs w:val="20"/>
+              </w:rPr>
+              <w:instrText xml:space="preserve"> ADDIN ZOTERO_ITEM CSL_CITATION {"citationID":"a1o51tp6alc","properties":{"unsorted":false,"formattedCitation":"(2025)","plainCitation":"(2025)","noteIndex":0},"citationItems":[{"id":63,"uris":["http://zotero.org/users/local/W3Vhviin/items/ASPXM773"],"itemData":{"id":63,"type":"article-journal","abstract":"This study presents an innovative programming assistance tool designed to address language barriers faced by Sinhala-speaking novice Java programmers. The tool provides real-time Java code generation and diagram creation based on Sinhala programming queries, enhancing conceptual understanding. Developed using a Design-Based Research methodology, the tool underwent iterative testing with 122 Sinhala-speaking learners, incorporating user feedback to refine usability and performance. Central to the system is Generative Pre-trained Transformer, version 3.5 Turbo, ensuring accurate translations and programming assistance, alongside a transformer-based model that translates Sinhala queries into English for processing. The translation model achieved 91.37% accuracy, with strong Bilingual Evaluation Understudy scores validating its contextual relevance. The tool’s practical applications extend beyond academia, supporting educational institutions, self-learners, and industry professionals in learning and skill development. Statistical evaluation of user performance demonstrated significant improvements in programming comprehension, reinforcing its effectiveness. By promoting inclusivity and expanding access to programming knowledge, this research contributes to the advancement of Sri Lanka’s technology sector and establishes a scalable framework for broader implementation in multilingual programming education.","container-title":"International Journal of Computer Theory and Engineering","DOI":"10.7763/IJCTE.2025.V17.1378","ISSN":"17938201","issue":"3","journalAbbreviation":"IJCTE","language":"en","page":"151-169","source":"DOI.org (Crossref)","title":"Bridging language barriers in programming education: Java programming assistance tool for Sinhala native speakers","title-short":"Bridging Language Barriers in Programming Education","volume":"17","author":[{"family":"Athukorala","given":"Kalpani Sachie Nelanka"},{"family":"De Silva","given":"Dilshan Indraraj"}],"issued":{"date-parts":[["2025"]]}},"suppress-author":true}],"schema":"https://github.com/citation-style-language/schema/raw/master/csl-citation.json"} </w:instrText>
+            </w:r>
+            <w:r>
+              <w:rPr>
+                <w:sz w:val="20"/>
+                <w:szCs w:val="20"/>
+              </w:rPr>
+              <w:fldChar w:fldCharType="separate"/>
+            </w:r>
+            <w:r>
+              <w:rPr>
+                <w:sz w:val="20"/>
+                <w:lang w:eastAsia="en-US"/>
+              </w:rPr>
+              <w:t>(2025)</w:t>
+            </w:r>
+            <w:r>
+              <w:rPr>
+                <w:sz w:val="20"/>
+                <w:szCs w:val="20"/>
+              </w:rPr>
+              <w:fldChar w:fldCharType="end"/>
+            </w:r>
+            <w:r>
+              <w:rPr>
+                <w:sz w:val="20"/>
+                <w:szCs w:val="20"/>
+              </w:rPr>
+              <w:t xml:space="preserve"> and van de Pol et al. </w:t>
+            </w:r>
+            <w:r>
+              <w:rPr>
+                <w:sz w:val="20"/>
+                <w:szCs w:val="20"/>
+              </w:rPr>
+              <w:fldChar w:fldCharType="begin"/>
+            </w:r>
+            <w:r>
+              <w:rPr>
+                <w:sz w:val="20"/>
+                <w:szCs w:val="20"/>
+              </w:rPr>
+              <w:instrText xml:space="preserve"> ADDIN ZOTERO_ITEM CSL_CITATION {"citationID":"a115d2h2sjh","properties":{"unsorted":false,"formattedCitation":"(2010)","plainCitation":"(2010)","noteIndex":0},"citationItems":[{"id":145,"uris":["http://zotero.org/users/local/W3Vhviin/items/ARFPCASM"],"itemData":{"id":145,"type":"article-journal","abstract":"Although scaffolding is an important and frequently studied concept, much discussion exists with regard to its conceptualizations, appearances, and effectiveness. Departing from the last decade’s scaffolding literature, this review scrutinizes these three areas of scaffolding. First, contingency, fading, and transfer of responsibility are discerned in this review as the three key characteristics of scaffolding. Second, an overview is presented of the numerous descriptive studies that provided narratives on the appearances of scaffolding and classifications of scaffolding strategies. These strategies are synthesized into a framework for analysis, distinguishing between scaffolding means and intentions. Third, the small number of effectiveness studies available is discussed and the results suggest that scaffolding is effective. However, more research is needed. The main challenge in scaffolding research appears to be its measurement. Based on the encountered and described measurement problems, suggestions for future research are made.","container-title":"Educational Psychology Review","DOI":"10.1007/s10648-010-9127-6","ISSN":"1573-336X","issue":"3","journalAbbreviation":"Educ Psychol Rev","language":"en","page":"271-296","source":"Springer Link","title":"Scaffolding in teacher–student interaction: A decade of research","title-short":"Scaffolding in Teacher–Student Interaction","volume":"22","author":[{"family":"Pol","given":"Janneke","non-dropping-particle":"van de"},{"family":"Volman","given":"Monique"},{"family":"Beishuizen","given":"Jos"}],"issued":{"date-parts":[["2010",9,1]]}},"suppress-author":true}],"schema":"https://github.com/citation-style-language/schema/raw/master/csl-citation.json"} </w:instrText>
+            </w:r>
+            <w:r>
+              <w:rPr>
+                <w:sz w:val="20"/>
+                <w:szCs w:val="20"/>
+              </w:rPr>
+              <w:fldChar w:fldCharType="separate"/>
+            </w:r>
+            <w:r>
+              <w:rPr>
+                <w:sz w:val="20"/>
+                <w:lang w:eastAsia="en-US"/>
+              </w:rPr>
+              <w:t>(2010)</w:t>
+            </w:r>
+            <w:r>
+              <w:rPr>
+                <w:sz w:val="20"/>
+                <w:szCs w:val="20"/>
+              </w:rPr>
+              <w:fldChar w:fldCharType="end"/>
+            </w:r>
+            <w:r>
+              <w:rPr>
+                <w:sz w:val="20"/>
+                <w:szCs w:val="20"/>
+              </w:rPr>
+              <w:t>. Structured content can remain inaccurate or repetitive</w:t>
             </w:r>
           </w:p>
         </w:tc>
@@ -19247,7 +20090,91 @@
                 <w:sz w:val="20"/>
                 <w:szCs w:val="20"/>
               </w:rPr>
-              <w:t>van de Pol et al. (2010) and Goodhue and Thompson (1995). Stated need is recorded, but competence is not measured</w:t>
+              <w:t xml:space="preserve">van de Pol et al. </w:t>
+            </w:r>
+            <w:r>
+              <w:rPr>
+                <w:sz w:val="20"/>
+                <w:szCs w:val="20"/>
+              </w:rPr>
+              <w:fldChar w:fldCharType="begin"/>
+            </w:r>
+            <w:r>
+              <w:rPr>
+                <w:sz w:val="20"/>
+                <w:szCs w:val="20"/>
+              </w:rPr>
+              <w:instrText xml:space="preserve"> ADDIN ZOTERO_ITEM CSL_CITATION {"citationID":"a15gh6t2ak2","properties":{"unsorted":false,"formattedCitation":"(2010)","plainCitation":"(2010)","noteIndex":0},"citationItems":[{"id":145,"uris":["http://zotero.org/users/local/W3Vhviin/items/ARFPCASM"],"itemData":{"id":145,"type":"article-journal","abstract":"Although scaffolding is an important and frequently studied concept, much discussion exists with regard to its conceptualizations, appearances, and effectiveness. Departing from the last decade’s scaffolding literature, this review scrutinizes these three areas of scaffolding. First, contingency, fading, and transfer of responsibility are discerned in this review as the three key characteristics of scaffolding. Second, an overview is presented of the numerous descriptive studies that provided narratives on the appearances of scaffolding and classifications of scaffolding strategies. These strategies are synthesized into a framework for analysis, distinguishing between scaffolding means and intentions. Third, the small number of effectiveness studies available is discussed and the results suggest that scaffolding is effective. However, more research is needed. The main challenge in scaffolding research appears to be its measurement. Based on the encountered and described measurement problems, suggestions for future research are made.","container-title":"Educational Psychology Review","DOI":"10.1007/s10648-010-9127-6","ISSN":"1573-336X","issue":"3","journalAbbreviation":"Educ Psychol Rev","language":"en","page":"271-296","source":"Springer Link","title":"Scaffolding in teacher–student interaction: A decade of research","title-short":"Scaffolding in Teacher–Student Interaction","volume":"22","author":[{"family":"Pol","given":"Janneke","non-dropping-particle":"van de"},{"family":"Volman","given":"Monique"},{"family":"Beishuizen","given":"Jos"}],"issued":{"date-parts":[["2010",9,1]]}},"suppress-author":true}],"schema":"https://github.com/citation-style-language/schema/raw/master/csl-citation.json"} </w:instrText>
+            </w:r>
+            <w:r>
+              <w:rPr>
+                <w:sz w:val="20"/>
+                <w:szCs w:val="20"/>
+              </w:rPr>
+              <w:fldChar w:fldCharType="separate"/>
+            </w:r>
+            <w:r>
+              <w:rPr>
+                <w:sz w:val="20"/>
+                <w:lang w:eastAsia="en-US"/>
+              </w:rPr>
+              <w:t>(2010)</w:t>
+            </w:r>
+            <w:r>
+              <w:rPr>
+                <w:sz w:val="20"/>
+                <w:szCs w:val="20"/>
+              </w:rPr>
+              <w:fldChar w:fldCharType="end"/>
+            </w:r>
+            <w:r>
+              <w:rPr>
+                <w:sz w:val="20"/>
+                <w:szCs w:val="20"/>
+              </w:rPr>
+              <w:t xml:space="preserve"> and Goodhue and Thompson </w:t>
+            </w:r>
+            <w:r>
+              <w:rPr>
+                <w:sz w:val="20"/>
+                <w:szCs w:val="20"/>
+              </w:rPr>
+              <w:fldChar w:fldCharType="begin"/>
+            </w:r>
+            <w:r>
+              <w:rPr>
+                <w:sz w:val="20"/>
+                <w:szCs w:val="20"/>
+              </w:rPr>
+              <w:instrText xml:space="preserve"> ADDIN ZOTERO_ITEM CSL_CITATION {"citationID":"a2jii6pmdq3","properties":{"unsorted":false,"formattedCitation":"(1995)","plainCitation":"(1995)","noteIndex":0},"citationItems":[{"id":137,"uris":["http://zotero.org/users/local/W3Vhviin/items/UMPPMIZC"],"itemData":{"id":137,"type":"article-journal","abstract":"A key concern in Information Systems (IS) research has been to better understand the linkage between information systems and individual performance. The research reported in this study has two primary objectives: (1) to propose a comprehensive theoretical model that incorporates valuable insights from two comple mentary streams of research, and (2) to empirically test the core of the model. At the heart of the new model is the assertion that for an information technology to have a positive impact on individual performance, the technology: (1) must be utilized and (2) must be a good fit with the tasks it supports. This new model is moderately supported by an analysis of data from over 600 individuals in two companies. This research highlights the importance of the fit between technologies and users' tasks in achieving individual performance impacts from information technology. It also suggests that task-technology fit, when decomposed into its more detailed components, could be the basis for a strong diagnostic tool to evaluate whether information systems and services in a given organization are meeting user needs.","container-title":"MIS Quarterly","DOI":"10.2307/249689","ISSN":"0276-7783","issue":"2","page":"213-236","publisher":"Management Information Systems Research Center, University of Minnesota","source":"JSTOR","title":"Task-technology fit and individual performance","volume":"19","author":[{"family":"Goodhue","given":"Dale L."},{"family":"Thompson","given":"Ronald L."}],"issued":{"date-parts":[["1995"]]}},"suppress-author":true}],"schema":"https://github.com/citation-style-language/schema/raw/master/csl-citation.json"} </w:instrText>
+            </w:r>
+            <w:r>
+              <w:rPr>
+                <w:sz w:val="20"/>
+                <w:szCs w:val="20"/>
+              </w:rPr>
+              <w:fldChar w:fldCharType="separate"/>
+            </w:r>
+            <w:r>
+              <w:rPr>
+                <w:sz w:val="20"/>
+                <w:lang w:eastAsia="en-US"/>
+              </w:rPr>
+              <w:t>(1995)</w:t>
+            </w:r>
+            <w:r>
+              <w:rPr>
+                <w:sz w:val="20"/>
+                <w:szCs w:val="20"/>
+              </w:rPr>
+              <w:fldChar w:fldCharType="end"/>
+            </w:r>
+            <w:r>
+              <w:rPr>
+                <w:sz w:val="20"/>
+                <w:szCs w:val="20"/>
+              </w:rPr>
+              <w:t>. Stated need is recorded, but competence is not measured</w:t>
             </w:r>
           </w:p>
         </w:tc>
@@ -19318,7 +20245,49 @@
                 <w:sz w:val="20"/>
                 <w:szCs w:val="20"/>
               </w:rPr>
-              <w:t>van de Pol et al. (2010). Routing and storage controls work, but suitable support levels and adaptation limits remain unproven</w:t>
+              <w:t xml:space="preserve">van de Pol et al. </w:t>
+            </w:r>
+            <w:r>
+              <w:rPr>
+                <w:sz w:val="20"/>
+                <w:szCs w:val="20"/>
+              </w:rPr>
+              <w:fldChar w:fldCharType="begin"/>
+            </w:r>
+            <w:r>
+              <w:rPr>
+                <w:sz w:val="20"/>
+                <w:szCs w:val="20"/>
+              </w:rPr>
+              <w:instrText xml:space="preserve"> ADDIN ZOTERO_ITEM CSL_CITATION {"citationID":"aj79tr400e","properties":{"unsorted":false,"formattedCitation":"(2010)","plainCitation":"(2010)","noteIndex":0},"citationItems":[{"id":145,"uris":["http://zotero.org/users/local/W3Vhviin/items/ARFPCASM"],"itemData":{"id":145,"type":"article-journal","abstract":"Although scaffolding is an important and frequently studied concept, much discussion exists with regard to its conceptualizations, appearances, and effectiveness. Departing from the last decade’s scaffolding literature, this review scrutinizes these three areas of scaffolding. First, contingency, fading, and transfer of responsibility are discerned in this review as the three key characteristics of scaffolding. Second, an overview is presented of the numerous descriptive studies that provided narratives on the appearances of scaffolding and classifications of scaffolding strategies. These strategies are synthesized into a framework for analysis, distinguishing between scaffolding means and intentions. Third, the small number of effectiveness studies available is discussed and the results suggest that scaffolding is effective. However, more research is needed. The main challenge in scaffolding research appears to be its measurement. Based on the encountered and described measurement problems, suggestions for future research are made.","container-title":"Educational Psychology Review","DOI":"10.1007/s10648-010-9127-6","ISSN":"1573-336X","issue":"3","journalAbbreviation":"Educ Psychol Rev","language":"en","page":"271-296","source":"Springer Link","title":"Scaffolding in teacher–student interaction: A decade of research","title-short":"Scaffolding in Teacher–Student Interaction","volume":"22","author":[{"family":"Pol","given":"Janneke","non-dropping-particle":"van de"},{"family":"Volman","given":"Monique"},{"family":"Beishuizen","given":"Jos"}],"issued":{"date-parts":[["2010",9,1]]}},"suppress-author":true}],"schema":"https://github.com/citation-style-language/schema/raw/master/csl-citation.json"} </w:instrText>
+            </w:r>
+            <w:r>
+              <w:rPr>
+                <w:sz w:val="20"/>
+                <w:szCs w:val="20"/>
+              </w:rPr>
+              <w:fldChar w:fldCharType="separate"/>
+            </w:r>
+            <w:r>
+              <w:rPr>
+                <w:sz w:val="20"/>
+                <w:lang w:eastAsia="en-US"/>
+              </w:rPr>
+              <w:t>(2010)</w:t>
+            </w:r>
+            <w:r>
+              <w:rPr>
+                <w:sz w:val="20"/>
+                <w:szCs w:val="20"/>
+              </w:rPr>
+              <w:fldChar w:fldCharType="end"/>
+            </w:r>
+            <w:r>
+              <w:rPr>
+                <w:sz w:val="20"/>
+                <w:szCs w:val="20"/>
+              </w:rPr>
+              <w:t>. Routing and storage controls work, but suitable support levels and adaptation limits remain unproven</w:t>
             </w:r>
           </w:p>
         </w:tc>
@@ -19390,7 +20359,58 @@
                 <w:sz w:val="20"/>
                 <w:szCs w:val="20"/>
               </w:rPr>
-              <w:t>Goodhue and Thompson (1995), applied to the supporting task. Tested topic limits do not establish accuracy for every question</w:t>
+              <w:t xml:space="preserve">Goodhue and </w:t>
+            </w:r>
+            <w:bookmarkStart w:id="1" w:name="_Hlk242195555"/>
+            <w:r>
+              <w:rPr>
+                <w:sz w:val="20"/>
+                <w:szCs w:val="20"/>
+              </w:rPr>
+              <w:t xml:space="preserve">Thompson </w:t>
+            </w:r>
+            <w:r>
+              <w:rPr>
+                <w:sz w:val="20"/>
+                <w:szCs w:val="20"/>
+              </w:rPr>
+              <w:fldChar w:fldCharType="begin"/>
+            </w:r>
+            <w:r>
+              <w:rPr>
+                <w:sz w:val="20"/>
+                <w:szCs w:val="20"/>
+              </w:rPr>
+              <w:instrText xml:space="preserve"> ADDIN ZOTERO_ITEM CSL_CITATION {"citationID":"a1mgt7hnk9q","properties":{"unsorted":false,"formattedCitation":"(1995)","plainCitation":"(1995)","noteIndex":0},"citationItems":[{"id":137,"uris":["http://zotero.org/users/local/W3Vhviin/items/UMPPMIZC"],"itemData":{"id":137,"type":"article-journal","abstract":"A key concern in Information Systems (IS) research has been to better understand the linkage between information systems and individual performance. The research reported in this study has two primary objectives: (1) to propose a comprehensive theoretical model that incorporates valuable insights from two comple mentary streams of research, and (2) to empirically test the core of the model. At the heart of the new model is the assertion that for an information technology to have a positive impact on individual performance, the technology: (1) must be utilized and (2) must be a good fit with the tasks it supports. This new model is moderately supported by an analysis of data from over 600 individuals in two companies. This research highlights the importance of the fit between technologies and users' tasks in achieving individual performance impacts from information technology. It also suggests that task-technology fit, when decomposed into its more detailed components, could be the basis for a strong diagnostic tool to evaluate whether information systems and services in a given organization are meeting user needs.","container-title":"MIS Quarterly","DOI":"10.2307/249689","ISSN":"0276-7783","issue":"2","page":"213-236","publisher":"Management Information Systems Research Center, University of Minnesota","source":"JSTOR","title":"Task-technology fit and individual performance","volume":"19","author":[{"family":"Goodhue","given":"Dale L."},{"family":"Thompson","given":"Ronald L."}],"issued":{"date-parts":[["1995"]]}},"suppress-author":true}],"schema":"https://github.com/citation-style-language/schema/raw/master/csl-citation.json"} </w:instrText>
+            </w:r>
+            <w:r>
+              <w:rPr>
+                <w:sz w:val="20"/>
+                <w:szCs w:val="20"/>
+              </w:rPr>
+              <w:fldChar w:fldCharType="separate"/>
+            </w:r>
+            <w:r>
+              <w:rPr>
+                <w:sz w:val="20"/>
+                <w:lang w:eastAsia="en-US"/>
+              </w:rPr>
+              <w:t>(1995)</w:t>
+            </w:r>
+            <w:r>
+              <w:rPr>
+                <w:sz w:val="20"/>
+                <w:szCs w:val="20"/>
+              </w:rPr>
+              <w:fldChar w:fldCharType="end"/>
+            </w:r>
+            <w:bookmarkEnd w:id="1"/>
+            <w:r>
+              <w:rPr>
+                <w:sz w:val="20"/>
+                <w:szCs w:val="20"/>
+              </w:rPr>
+              <w:t>, applied to the supporting task. Tested topic limits do not establish accuracy for every question</w:t>
             </w:r>
           </w:p>
         </w:tc>
@@ -19461,7 +20481,49 @@
                 <w:sz w:val="20"/>
                 <w:szCs w:val="20"/>
               </w:rPr>
-              <w:t>Goodhue and Thompson (1995), applied to task continuity. Storage works, but interface problems and unmeasured task suitability remain</w:t>
+              <w:t xml:space="preserve">Goodhue and Thompson </w:t>
+            </w:r>
+            <w:r>
+              <w:rPr>
+                <w:sz w:val="20"/>
+                <w:szCs w:val="20"/>
+              </w:rPr>
+              <w:fldChar w:fldCharType="begin"/>
+            </w:r>
+            <w:r>
+              <w:rPr>
+                <w:sz w:val="20"/>
+                <w:szCs w:val="20"/>
+              </w:rPr>
+              <w:instrText xml:space="preserve"> ADDIN ZOTERO_ITEM CSL_CITATION {"citationID":"8Q9etJme","properties":{"unsorted":false,"formattedCitation":"(1995)","plainCitation":"(1995)","noteIndex":0},"citationItems":[{"id":137,"uris":["http://zotero.org/users/local/W3Vhviin/items/UMPPMIZC"],"itemData":{"id":137,"type":"article-journal","abstract":"A key concern in Information Systems (IS) research has been to better understand the linkage between information systems and individual performance. The research reported in this study has two primary objectives: (1) to propose a comprehensive theoretical model that incorporates valuable insights from two comple mentary streams of research, and (2) to empirically test the core of the model. At the heart of the new model is the assertion that for an information technology to have a positive impact on individual performance, the technology: (1) must be utilized and (2) must be a good fit with the tasks it supports. This new model is moderately supported by an analysis of data from over 600 individuals in two companies. This research highlights the importance of the fit between technologies and users' tasks in achieving individual performance impacts from information technology. It also suggests that task-technology fit, when decomposed into its more detailed components, could be the basis for a strong diagnostic tool to evaluate whether information systems and services in a given organization are meeting user needs.","container-title":"MIS Quarterly","DOI":"10.2307/249689","ISSN":"0276-7783","issue":"2","page":"213-236","publisher":"Management Information Systems Research Center, University of Minnesota","source":"JSTOR","title":"Task-technology fit and individual performance","volume":"19","author":[{"family":"Goodhue","given":"Dale L."},{"family":"Thompson","given":"Ronald L."}],"issued":{"date-parts":[["1995"]]}},"suppress-author":true}],"schema":"https://github.com/citation-style-language/schema/raw/master/csl-citation.json"} </w:instrText>
+            </w:r>
+            <w:r>
+              <w:rPr>
+                <w:sz w:val="20"/>
+                <w:szCs w:val="20"/>
+              </w:rPr>
+              <w:fldChar w:fldCharType="separate"/>
+            </w:r>
+            <w:r>
+              <w:rPr>
+                <w:sz w:val="20"/>
+                <w:lang w:eastAsia="en-US"/>
+              </w:rPr>
+              <w:t>(1995)</w:t>
+            </w:r>
+            <w:r>
+              <w:rPr>
+                <w:sz w:val="20"/>
+                <w:szCs w:val="20"/>
+              </w:rPr>
+              <w:fldChar w:fldCharType="end"/>
+            </w:r>
+            <w:r>
+              <w:rPr>
+                <w:sz w:val="20"/>
+                <w:szCs w:val="20"/>
+              </w:rPr>
+              <w:t>, applied to task continuity. Storage works, but interface problems and unmeasured task suitability remain</w:t>
             </w:r>
           </w:p>
         </w:tc>
@@ -19532,7 +20594,56 @@
                 <w:sz w:val="20"/>
                 <w:szCs w:val="20"/>
               </w:rPr>
-              <w:t>Controls were introduced in response to generated-content risks described by Ji et al. (2024). Stored-state protection was supported by tests, not directly validated by that literature. Duplicate calls and delivery failures remain</w:t>
+              <w:t>Controls were introduced in response to generated-content risks described by Ji et al.</w:t>
+            </w:r>
+            <w:r>
+              <w:rPr>
+                <w:sz w:val="20"/>
+                <w:szCs w:val="20"/>
+              </w:rPr>
+              <w:t xml:space="preserve"> </w:t>
+            </w:r>
+            <w:r>
+              <w:rPr>
+                <w:sz w:val="20"/>
+                <w:szCs w:val="20"/>
+              </w:rPr>
+              <w:fldChar w:fldCharType="begin"/>
+            </w:r>
+            <w:r>
+              <w:rPr>
+                <w:sz w:val="20"/>
+                <w:szCs w:val="20"/>
+              </w:rPr>
+              <w:instrText xml:space="preserve"> ADDIN ZOTERO_ITEM CSL_CITATION {"citationID":"Ox8yVnPU","properties":{"unsorted":false,"formattedCitation":"(2023)","plainCitation":"(2023)","noteIndex":0},"citationItems":[{"id":164,"uris":["http://zotero.org/users/local/W3Vhviin/items/G2SVVUX3"],"itemData":{"id":164,"type":"article-journal","abstract":"Natural Language Generation (NLG) has improved exponentially in recent years thanks to the development of sequence-to-sequence deep learning technologies such as Transformer-based language models. This advancement has led to more fluent and coherent NLG, leading to improved development in downstream tasks such as abstractive summarization, dialogue generation, and data-to-text generation. However, it is also apparent that deep learning based generation is prone to hallucinate unintended text, which degrades the system performance and fails to meet user expectations in many real-world scenarios. To address this issue, many studies have been presented in measuring and mitigating hallucinated texts, but these have never been reviewed in a comprehensive manner before.In this survey, we thus provide a broad overview of the research progress and challenges in the hallucination problem in NLG. The survey is organized into two parts: (1) a general overview of metrics, mitigation methods, and future directions, and (2) an overview of task-specific research progress on hallucinations in the following downstream tasks, namely abstractive summarization, dialogue generation, generative question answering, data-to-text generation, and machine translation. This survey serves to facilitate collaborative efforts among researchers in tackling the challenge of hallucinated texts in NLG.","container-title":"ACM Computing Surveys","DOI":"10.1145/3571730","ISSN":"0360-0300","issue":"12","journalAbbreviation":"ACM Comput. Surv.","note":"number: 248","page":"248:1–248:38","source":"ACM Digital Library","title":"Survey of hallucination in natural language generation","volume":"55","author":[{"family":"Ji","given":"Ziwei"},{"family":"Lee","given":"Nayeon"},{"family":"Frieske","given":"Rita"},{"family":"Yu","given":"Tiezheng"},{"family":"Su","given":"Dan"},{"family":"Xu","given":"Yan"},{"family":"Ishii","given":"Etsuko"},{"family":"Bang","given":"Ye Jin"},{"family":"Madotto","given":"Andrea"},{"family":"Fung","given":"Pascale"}],"issued":{"date-parts":[["2023",3,3]]}},"suppress-author":true}],"schema":"https://github.com/citation-style-language/schema/raw/master/csl-citation.json"} </w:instrText>
+            </w:r>
+            <w:r>
+              <w:rPr>
+                <w:sz w:val="20"/>
+                <w:szCs w:val="20"/>
+              </w:rPr>
+              <w:fldChar w:fldCharType="separate"/>
+            </w:r>
+            <w:r>
+              <w:rPr>
+                <w:sz w:val="20"/>
+                <w:lang w:eastAsia="en-US"/>
+              </w:rPr>
+              <w:t>(2023)</w:t>
+            </w:r>
+            <w:r>
+              <w:rPr>
+                <w:sz w:val="20"/>
+                <w:szCs w:val="20"/>
+              </w:rPr>
+              <w:fldChar w:fldCharType="end"/>
+            </w:r>
+            <w:r>
+              <w:rPr>
+                <w:sz w:val="20"/>
+                <w:szCs w:val="20"/>
+              </w:rPr>
+              <w:t>. Stored-state protection was supported by tests, not directly validated by that literature. Duplicate calls and delivery failures remain</w:t>
             </w:r>
           </w:p>
         </w:tc>
@@ -19771,7 +20882,21 @@
                 <w:sz w:val="20"/>
                 <w:szCs w:val="20"/>
               </w:rPr>
-              <w:t>Critical evaluation of specialised/low-resource output was well justified. Output quality was not certified</w:t>
+              <w:t xml:space="preserve">Critical evaluation of </w:t>
+            </w:r>
+            <w:r>
+              <w:rPr>
+                <w:sz w:val="20"/>
+                <w:szCs w:val="20"/>
+              </w:rPr>
+              <w:t>specialized</w:t>
+            </w:r>
+            <w:r>
+              <w:rPr>
+                <w:sz w:val="20"/>
+                <w:szCs w:val="20"/>
+              </w:rPr>
+              <w:t>/low-resource output was well justified. Output quality was not certified</w:t>
             </w:r>
           </w:p>
         </w:tc>
@@ -20005,12 +21130,12 @@
       </w:r>
     </w:p>
     <w:sectPr>
-      <w:headerReference w:type="even" r:id="rId12"/>
-      <w:headerReference w:type="default" r:id="rId13"/>
-      <w:footerReference w:type="even" r:id="rId14"/>
-      <w:footerReference w:type="default" r:id="rId15"/>
-      <w:headerReference w:type="first" r:id="rId16"/>
-      <w:footerReference w:type="first" r:id="rId17"/>
+      <w:headerReference w:type="even" r:id="rId9"/>
+      <w:headerReference w:type="default" r:id="rId10"/>
+      <w:footerReference w:type="even" r:id="rId11"/>
+      <w:footerReference w:type="default" r:id="rId12"/>
+      <w:headerReference w:type="first" r:id="rId13"/>
+      <w:footerReference w:type="first" r:id="rId14"/>
       <w:pgSz w:w="12240" w:h="15840"/>
       <w:pgMar w:top="1440" w:right="1440" w:bottom="1440" w:left="1440" w:header="677" w:footer="346" w:gutter="0"/>
       <w:cols w:space="720"/>
@@ -25005,7 +26130,7 @@
   <w:style w:type="paragraph" w:default="1" w:styleId="Normal">
     <w:name w:val="Normal"/>
     <w:qFormat/>
-    <w:rsid w:val="000551AB"/>
+    <w:rsid w:val="00A94FFC"/>
     <w:pPr>
       <w:suppressAutoHyphens w:val="0"/>
     </w:pPr>

</xml_diff>